<commit_message>
Agregando Proyecto de Flutter
</commit_message>
<xml_diff>
--- a/Documents/Avance del Proyecto - Direccion General Hospitalaria (2).docx
+++ b/Documents/Avance del Proyecto - Direccion General Hospitalaria (2).docx
@@ -2042,7 +2042,7 @@
       </w:sdtContent>
     </w:sdt>
     <w:p>
-      <w:bookmarkStart w:id="2" w:name="_Toc178889673"/>
+      <w:bookmarkStart w:id="1" w:name="_Toc178889673"/>
     </w:p>
     <w:p/>
     <w:p/>
@@ -2079,7 +2079,7 @@
         <w:lastRenderedPageBreak/>
         <w:t>Introducción</w:t>
       </w:r>
-      <w:bookmarkEnd w:id="2"/>
+      <w:bookmarkEnd w:id="1"/>
     </w:p>
     <w:p>
       <w:pPr>
@@ -2440,13 +2440,8 @@
         </w:numPr>
         <w:jc w:val="both"/>
       </w:pPr>
-      <w:proofErr w:type="spellStart"/>
-      <w:r>
-        <w:t>Flutter</w:t>
-      </w:r>
-      <w:proofErr w:type="spellEnd"/>
-      <w:r>
-        <w:t xml:space="preserve"> </w:t>
+      <w:r>
+        <w:t xml:space="preserve">Flutter </w:t>
       </w:r>
     </w:p>
     <w:p>
@@ -2472,15 +2467,7 @@
         <w:jc w:val="both"/>
       </w:pPr>
       <w:r>
-        <w:t xml:space="preserve">Python - </w:t>
-      </w:r>
-      <w:proofErr w:type="spellStart"/>
-      <w:r>
-        <w:t>Fast</w:t>
-      </w:r>
-      <w:proofErr w:type="spellEnd"/>
-      <w:r>
-        <w:t xml:space="preserve"> Api</w:t>
+        <w:t>Python - Fast Api</w:t>
       </w:r>
     </w:p>
     <w:p>
@@ -2506,15 +2493,7 @@
         <w:jc w:val="both"/>
       </w:pPr>
       <w:r>
-        <w:t xml:space="preserve">Amazon </w:t>
-      </w:r>
-      <w:proofErr w:type="spellStart"/>
-      <w:r>
-        <w:t>Amplify</w:t>
-      </w:r>
-      <w:proofErr w:type="spellEnd"/>
-      <w:r>
-        <w:t xml:space="preserve"> </w:t>
+        <w:t xml:space="preserve">Amazon Amplify </w:t>
       </w:r>
     </w:p>
     <w:p>
@@ -2526,13 +2505,8 @@
         </w:numPr>
         <w:jc w:val="both"/>
       </w:pPr>
-      <w:proofErr w:type="spellStart"/>
-      <w:r>
-        <w:t>Aiven</w:t>
-      </w:r>
-      <w:proofErr w:type="spellEnd"/>
-      <w:r>
-        <w:t xml:space="preserve"> – Para la construcción de BD remota </w:t>
+      <w:r>
+        <w:t xml:space="preserve">Aiven – Para la construcción de BD remota </w:t>
       </w:r>
     </w:p>
     <w:p>
@@ -2667,7 +2641,7 @@
                                 <w:szCs w:val="22"/>
                               </w:rPr>
                             </w:pPr>
-                            <w:bookmarkStart w:id="3" w:name="_Toc152542169"/>
+                            <w:bookmarkStart w:id="2" w:name="_Toc152542169"/>
                             <w:r>
                               <w:rPr>
                                 <w:rStyle w:val="nfasis"/>
@@ -2699,9 +2673,55 @@
                                 <w:sz w:val="22"/>
                                 <w:szCs w:val="22"/>
                               </w:rPr>
-                              <w:t>VAS de la UTXJ con relación en las Empresas para los proyectos de estadía y la calidad de mejora de sus procesos de enseñanza y aplicación práctica.</w:t>
+                              <w:t>VAS d</w:t>
                             </w:r>
-                            <w:bookmarkEnd w:id="3"/>
+                            <w:r>
+                              <w:rPr>
+                                <w:rStyle w:val="nfasis"/>
+                                <w:b/>
+                                <w:bCs/>
+                                <w:color w:val="000000" w:themeColor="text1"/>
+                                <w:sz w:val="22"/>
+                                <w:szCs w:val="22"/>
+                              </w:rPr>
+                              <w:t xml:space="preserve">el </w:t>
+                            </w:r>
+                            <w:proofErr w:type="spellStart"/>
+                            <w:r>
+                              <w:rPr>
+                                <w:rStyle w:val="nfasis"/>
+                                <w:b/>
+                                <w:bCs/>
+                                <w:color w:val="000000" w:themeColor="text1"/>
+                                <w:sz w:val="22"/>
+                                <w:szCs w:val="22"/>
+                              </w:rPr>
+                              <w:t>Hopital</w:t>
+                            </w:r>
+                            <w:proofErr w:type="spellEnd"/>
+                            <w:r>
+                              <w:rPr>
+                                <w:rStyle w:val="nfasis"/>
+                                <w:b/>
+                                <w:bCs/>
+                                <w:color w:val="000000" w:themeColor="text1"/>
+                                <w:sz w:val="22"/>
+                                <w:szCs w:val="22"/>
+                              </w:rPr>
+                              <w:t xml:space="preserve"> Privilege Care</w:t>
+                            </w:r>
+                            <w:r>
+                              <w:rPr>
+                                <w:rStyle w:val="nfasis"/>
+                                <w:b/>
+                                <w:bCs/>
+                                <w:color w:val="000000" w:themeColor="text1"/>
+                                <w:sz w:val="22"/>
+                                <w:szCs w:val="22"/>
+                              </w:rPr>
+                              <w:t>.</w:t>
+                            </w:r>
+                            <w:bookmarkEnd w:id="2"/>
                           </w:p>
                         </w:txbxContent>
                       </wps:txbx>
@@ -2770,7 +2790,77 @@
                           <w:sz w:val="22"/>
                           <w:szCs w:val="22"/>
                         </w:rPr>
-                        <w:t>VAS de la UTXJ con relación en las Empresas para los proyectos de estadía y la calidad de mejora de sus procesos de enseñanza y aplicación práctica.</w:t>
+                        <w:t>VAS d</w:t>
+                      </w:r>
+                      <w:r>
+                        <w:rPr>
+                          <w:rStyle w:val="nfasis"/>
+                          <w:b/>
+                          <w:bCs/>
+                          <w:color w:val="000000" w:themeColor="text1"/>
+                          <w:sz w:val="22"/>
+                          <w:szCs w:val="22"/>
+                        </w:rPr>
+                        <w:t xml:space="preserve">el </w:t>
+                      </w:r>
+                      <w:proofErr w:type="spellStart"/>
+                      <w:r>
+                        <w:rPr>
+                          <w:rStyle w:val="nfasis"/>
+                          <w:b/>
+                          <w:bCs/>
+                          <w:color w:val="000000" w:themeColor="text1"/>
+                          <w:sz w:val="22"/>
+                          <w:szCs w:val="22"/>
+                        </w:rPr>
+                        <w:t>Hopital</w:t>
+                      </w:r>
+                      <w:proofErr w:type="spellEnd"/>
+                      <w:r>
+                        <w:rPr>
+                          <w:rStyle w:val="nfasis"/>
+                          <w:b/>
+                          <w:bCs/>
+                          <w:color w:val="000000" w:themeColor="text1"/>
+                          <w:sz w:val="22"/>
+                          <w:szCs w:val="22"/>
+                        </w:rPr>
+                        <w:t xml:space="preserve"> </w:t>
+                      </w:r>
+                      <w:proofErr w:type="spellStart"/>
+                      <w:r>
+                        <w:rPr>
+                          <w:rStyle w:val="nfasis"/>
+                          <w:b/>
+                          <w:bCs/>
+                          <w:color w:val="000000" w:themeColor="text1"/>
+                          <w:sz w:val="22"/>
+                          <w:szCs w:val="22"/>
+                        </w:rPr>
+                        <w:t>Privilege</w:t>
+                      </w:r>
+                      <w:proofErr w:type="spellEnd"/>
+                      <w:r>
+                        <w:rPr>
+                          <w:rStyle w:val="nfasis"/>
+                          <w:b/>
+                          <w:bCs/>
+                          <w:color w:val="000000" w:themeColor="text1"/>
+                          <w:sz w:val="22"/>
+                          <w:szCs w:val="22"/>
+                        </w:rPr>
+                        <w:t xml:space="preserve"> Care</w:t>
+                      </w:r>
+                      <w:r>
+                        <w:rPr>
+                          <w:rStyle w:val="nfasis"/>
+                          <w:b/>
+                          <w:bCs/>
+                          <w:color w:val="000000" w:themeColor="text1"/>
+                          <w:sz w:val="22"/>
+                          <w:szCs w:val="22"/>
+                        </w:rPr>
+                        <w:t>.</w:t>
                       </w:r>
                       <w:bookmarkEnd w:id="4"/>
                     </w:p>
@@ -2781,6 +2871,7 @@
           </mc:Fallback>
         </mc:AlternateContent>
       </w:r>
+      <w:bookmarkStart w:id="3" w:name="_Hlk180495007"/>
     </w:p>
     <w:p>
       <w:pPr>
@@ -2808,7 +2899,7 @@
         <mc:AlternateContent>
           <mc:Choice Requires="wpg">
             <w:drawing>
-              <wp:anchor distT="0" distB="0" distL="114300" distR="114300" simplePos="0" relativeHeight="251678720" behindDoc="0" locked="0" layoutInCell="1" allowOverlap="1" wp14:anchorId="0529000C" wp14:editId="684CA9D3">
+              <wp:anchor distT="0" distB="0" distL="114300" distR="114300" simplePos="0" relativeHeight="251678720" behindDoc="0" locked="0" layoutInCell="1" allowOverlap="1" wp14:anchorId="0529000C" wp14:editId="1DCEC308">
                 <wp:simplePos x="0" y="0"/>
                 <wp:positionH relativeFrom="column">
                   <wp:posOffset>367030</wp:posOffset>
@@ -3866,7 +3957,7 @@
                         <wps:spPr>
                           <a:xfrm>
                             <a:off x="8943975" y="458259"/>
-                            <a:ext cx="2495550" cy="456142"/>
+                            <a:ext cx="2495550" cy="265641"/>
                           </a:xfrm>
                           <a:prstGeom prst="snip1Rect">
                             <a:avLst/>
@@ -3903,28 +3994,19 @@
                                 <w:jc w:val="both"/>
                                 <w:rPr>
                                   <w:color w:val="000000" w:themeColor="text1"/>
-                                  <w:sz w:val="16"/>
-                                  <w:szCs w:val="16"/>
+                                  <w:sz w:val="14"/>
+                                  <w:szCs w:val="14"/>
                                   <w:lang w:val="es-MX"/>
                                 </w:rPr>
                               </w:pPr>
                               <w:r>
                                 <w:rPr>
                                   <w:color w:val="000000" w:themeColor="text1"/>
-                                  <w:sz w:val="14"/>
-                                  <w:szCs w:val="14"/>
+                                  <w:sz w:val="12"/>
+                                  <w:szCs w:val="12"/>
                                   <w:lang w:val="es-MX"/>
                                 </w:rPr>
-                                <w:t>Contacto con los potenciales clientes, que atienden el sector Salud</w:t>
-                              </w:r>
-                              <w:r>
-                                <w:rPr>
-                                  <w:color w:val="000000" w:themeColor="text1"/>
-                                  <w:sz w:val="16"/>
-                                  <w:szCs w:val="16"/>
-                                  <w:lang w:val="es-MX"/>
-                                </w:rPr>
-                                <w:t>.</w:t>
+                                <w:t>Asistencia Personalizada y Soporte Técnico</w:t>
                               </w:r>
                             </w:p>
                           </w:txbxContent>
@@ -3941,8 +4023,8 @@
                         <wps:cNvSpPr/>
                         <wps:spPr>
                           <a:xfrm>
-                            <a:off x="8953500" y="983827"/>
-                            <a:ext cx="2495550" cy="382906"/>
+                            <a:off x="8953500" y="780627"/>
+                            <a:ext cx="2495550" cy="349673"/>
                           </a:xfrm>
                           <a:prstGeom prst="snip1Rect">
                             <a:avLst/>
@@ -3978,25 +4060,25 @@
                                 </w:numPr>
                                 <w:rPr>
                                   <w:color w:val="000000" w:themeColor="text1"/>
-                                  <w:sz w:val="14"/>
-                                  <w:szCs w:val="14"/>
+                                  <w:sz w:val="12"/>
+                                  <w:szCs w:val="12"/>
                                   <w:lang w:val="es-MX"/>
                                 </w:rPr>
                               </w:pPr>
                               <w:r>
                                 <w:rPr>
                                   <w:color w:val="000000" w:themeColor="text1"/>
-                                  <w:sz w:val="14"/>
-                                  <w:szCs w:val="14"/>
+                                  <w:sz w:val="12"/>
+                                  <w:szCs w:val="12"/>
                                   <w:lang w:val="es-MX"/>
                                 </w:rPr>
-                                <w:t>Programación de Reuniones con clientes potenciales para demostraciones</w:t>
+                                <w:t>Capacitaciones y demostraciones de uso del producto</w:t>
                               </w:r>
                               <w:r>
                                 <w:rPr>
                                   <w:color w:val="000000" w:themeColor="text1"/>
-                                  <w:sz w:val="14"/>
-                                  <w:szCs w:val="14"/>
+                                  <w:sz w:val="12"/>
+                                  <w:szCs w:val="12"/>
                                   <w:lang w:val="es-MX"/>
                                 </w:rPr>
                                 <w:t>.</w:t>
@@ -4016,8 +4098,8 @@
                         <wps:cNvSpPr/>
                         <wps:spPr>
                           <a:xfrm>
-                            <a:off x="8943975" y="1411605"/>
-                            <a:ext cx="2495550" cy="455295"/>
+                            <a:off x="8953500" y="1181735"/>
+                            <a:ext cx="2495550" cy="291465"/>
                           </a:xfrm>
                           <a:prstGeom prst="snip1Rect">
                             <a:avLst/>
@@ -4053,46 +4135,19 @@
                                 </w:numPr>
                                 <w:rPr>
                                   <w:color w:val="000000" w:themeColor="text1"/>
-                                  <w:sz w:val="20"/>
-                                  <w:szCs w:val="20"/>
+                                  <w:sz w:val="18"/>
+                                  <w:szCs w:val="18"/>
                                   <w:lang w:val="es-MX"/>
                                 </w:rPr>
                               </w:pPr>
                               <w:r>
                                 <w:rPr>
                                   <w:color w:val="000000" w:themeColor="text1"/>
-                                  <w:sz w:val="14"/>
-                                  <w:szCs w:val="14"/>
+                                  <w:sz w:val="12"/>
+                                  <w:szCs w:val="12"/>
                                   <w:lang w:val="es-MX"/>
                                 </w:rPr>
-                                <w:t xml:space="preserve">Enlace con Empresas de </w:t>
-                              </w:r>
-                              <w:r>
-                                <w:rPr>
-                                  <w:color w:val="000000" w:themeColor="text1"/>
-                                  <w:sz w:val="14"/>
-                                  <w:szCs w:val="14"/>
-                                  <w:lang w:val="es-MX"/>
-                                </w:rPr>
-                                <w:t>Gestión</w:t>
-                              </w:r>
-                              <w:r>
-                                <w:rPr>
-                                  <w:color w:val="000000" w:themeColor="text1"/>
-                                  <w:sz w:val="14"/>
-                                  <w:szCs w:val="14"/>
-                                  <w:lang w:val="es-MX"/>
-                                </w:rPr>
-                                <w:t xml:space="preserve"> </w:t>
-                              </w:r>
-                              <w:r>
-                                <w:rPr>
-                                  <w:color w:val="000000" w:themeColor="text1"/>
-                                  <w:sz w:val="14"/>
-                                  <w:szCs w:val="14"/>
-                                  <w:lang w:val="es-MX"/>
-                                </w:rPr>
-                                <w:t>Medica y Asociaciones Clínicas.</w:t>
+                                <w:t>Experiencia de Usuario.</w:t>
                               </w:r>
                             </w:p>
                           </w:txbxContent>
@@ -4109,8 +4164,8 @@
                         <wps:cNvSpPr/>
                         <wps:spPr>
                           <a:xfrm>
-                            <a:off x="8943975" y="1933575"/>
-                            <a:ext cx="2495550" cy="430530"/>
+                            <a:off x="8956675" y="1514476"/>
+                            <a:ext cx="2495550" cy="259080"/>
                           </a:xfrm>
                           <a:prstGeom prst="snip1Rect">
                             <a:avLst/>
@@ -4146,28 +4201,28 @@
                                 </w:numPr>
                                 <w:rPr>
                                   <w:color w:val="000000" w:themeColor="text1"/>
-                                  <w:sz w:val="16"/>
-                                  <w:szCs w:val="16"/>
+                                  <w:sz w:val="12"/>
+                                  <w:szCs w:val="12"/>
                                   <w:lang w:val="es-MX"/>
                                 </w:rPr>
                               </w:pPr>
                               <w:r>
                                 <w:rPr>
                                   <w:color w:val="000000" w:themeColor="text1"/>
-                                  <w:sz w:val="16"/>
-                                  <w:szCs w:val="16"/>
+                                  <w:sz w:val="12"/>
+                                  <w:szCs w:val="12"/>
                                   <w:lang w:val="es-MX"/>
                                 </w:rPr>
-                                <w:t>Publicidad a través del sitio web</w:t>
+                                <w:t>Mantenimiento y personalización del producto</w:t>
                               </w:r>
                               <w:r>
                                 <w:rPr>
                                   <w:color w:val="000000" w:themeColor="text1"/>
-                                  <w:sz w:val="16"/>
-                                  <w:szCs w:val="16"/>
+                                  <w:sz w:val="12"/>
+                                  <w:szCs w:val="12"/>
                                   <w:lang w:val="es-MX"/>
                                 </w:rPr>
-                                <w:t xml:space="preserve"> y gestión de Marketing. </w:t>
+                                <w:t xml:space="preserve">. </w:t>
                               </w:r>
                             </w:p>
                           </w:txbxContent>
@@ -4838,7 +4893,25 @@
                                   <w:szCs w:val="16"/>
                                   <w:lang w:val="es-MX"/>
                                 </w:rPr>
-                                <w:t>Áreas de Especialidades Medicas</w:t>
+                                <w:t xml:space="preserve">Dueños de </w:t>
+                              </w:r>
+                              <w:r>
+                                <w:rPr>
+                                  <w:color w:val="000000" w:themeColor="text1"/>
+                                  <w:sz w:val="16"/>
+                                  <w:szCs w:val="16"/>
+                                  <w:lang w:val="es-MX"/>
+                                </w:rPr>
+                                <w:t>Farmacéuticas</w:t>
+                              </w:r>
+                              <w:r>
+                                <w:rPr>
+                                  <w:color w:val="000000" w:themeColor="text1"/>
+                                  <w:sz w:val="16"/>
+                                  <w:szCs w:val="16"/>
+                                  <w:lang w:val="es-MX"/>
+                                </w:rPr>
+                                <w:t xml:space="preserve"> </w:t>
                               </w:r>
                             </w:p>
                           </w:txbxContent>
@@ -5516,7 +5589,7 @@
           </mc:Choice>
           <mc:Fallback>
             <w:pict>
-              <v:group w14:anchorId="0529000C" id="Grupo 55" o:spid="_x0000_s1030" style="position:absolute;margin-left:28.9pt;margin-top:13.95pt;width:1135.05pt;height:657pt;z-index:251678720;mso-width-relative:margin" coordsize="144151,83439" o:gfxdata="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">
+              <v:group w14:anchorId="0529000C" id="Grupo 55" o:spid="_x0000_s1030" style="position:absolute;margin-left:28.9pt;margin-top:13.95pt;width:1135.05pt;height:657pt;z-index:251678720;mso-width-relative:margin" coordsize="144151,83439" o:gfxdata="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">
                 <v:roundrect id="Cuadro de texto 6" o:spid="_x0000_s1031" style="position:absolute;width:27749;height:62579;visibility:visible;mso-wrap-style:square;v-text-anchor:top" arcsize="10923f" o:gfxdata="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" fillcolor="white [3201]" strokeweight=".5pt">
                   <v:textbox>
                     <w:txbxContent>
@@ -5989,10 +6062,10 @@
                     </w:txbxContent>
                   </v:textbox>
                 </v:shape>
-                <v:shape id="Rectángulo: una sola esquina cortada 27" o:spid="_x0000_s1050" style="position:absolute;left:89439;top:4582;width:24956;height:4562;visibility:visible;mso-wrap-style:square;v-text-anchor:middle" coordsize="2495550,456142" o:spt="100" o:gfxdata="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" adj="-11796480,,5400" path="m,l2419525,r76025,76025l2495550,456142,,456142,,xe" fillcolor="#ffc" strokecolor="#021730 [1604]" strokeweight="1.25pt">
+                <v:shape id="Rectángulo: una sola esquina cortada 27" o:spid="_x0000_s1050" style="position:absolute;left:89439;top:4582;width:24956;height:2657;visibility:visible;mso-wrap-style:square;v-text-anchor:middle" coordsize="2495550,265641" o:spt="100" o:gfxdata="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" adj="-11796480,,5400" path="m,l2451276,r44274,44274l2495550,265641,,265641,,xe" fillcolor="#ffc" strokecolor="#021730 [1604]" strokeweight="1.25pt">
                   <v:stroke joinstyle="miter" endcap="round"/>
                   <v:formulas/>
-                  <v:path arrowok="t" o:connecttype="custom" o:connectlocs="0,0;2419525,0;2495550,76025;2495550,456142;0,456142;0,0" o:connectangles="0,0,0,0,0,0" textboxrect="0,0,2495550,456142"/>
+                  <v:path arrowok="t" o:connecttype="custom" o:connectlocs="0,0;2451276,0;2495550,44274;2495550,265641;0,265641;0,0" o:connectangles="0,0,0,0,0,0" textboxrect="0,0,2495550,265641"/>
                   <v:textbox>
                     <w:txbxContent>
                       <w:p>
@@ -6005,37 +6078,28 @@
                           <w:jc w:val="both"/>
                           <w:rPr>
                             <w:color w:val="000000" w:themeColor="text1"/>
-                            <w:sz w:val="16"/>
-                            <w:szCs w:val="16"/>
+                            <w:sz w:val="14"/>
+                            <w:szCs w:val="14"/>
                             <w:lang w:val="es-MX"/>
                           </w:rPr>
                         </w:pPr>
                         <w:r>
                           <w:rPr>
                             <w:color w:val="000000" w:themeColor="text1"/>
-                            <w:sz w:val="14"/>
-                            <w:szCs w:val="14"/>
+                            <w:sz w:val="12"/>
+                            <w:szCs w:val="12"/>
                             <w:lang w:val="es-MX"/>
                           </w:rPr>
-                          <w:t>Contacto con los potenciales clientes, que atienden el sector Salud</w:t>
-                        </w:r>
-                        <w:r>
-                          <w:rPr>
-                            <w:color w:val="000000" w:themeColor="text1"/>
-                            <w:sz w:val="16"/>
-                            <w:szCs w:val="16"/>
-                            <w:lang w:val="es-MX"/>
-                          </w:rPr>
-                          <w:t>.</w:t>
+                          <w:t>Asistencia Personalizada y Soporte Técnico</w:t>
                         </w:r>
                       </w:p>
                     </w:txbxContent>
                   </v:textbox>
                 </v:shape>
-                <v:shape id="Rectángulo: una sola esquina cortada 28" o:spid="_x0000_s1051" style="position:absolute;left:89535;top:9838;width:24955;height:3829;visibility:visible;mso-wrap-style:square;v-text-anchor:middle" coordsize="2495550,382906" o:spt="100" o:gfxdata="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" adj="-11796480,,5400" path="m,l2431731,r63819,63819l2495550,382906,,382906,,xe" fillcolor="#ffc" strokecolor="#021730 [1604]" strokeweight="1.25pt">
+                <v:shape id="Rectángulo: una sola esquina cortada 28" o:spid="_x0000_s1051" style="position:absolute;left:89535;top:7806;width:24955;height:3497;visibility:visible;mso-wrap-style:square;v-text-anchor:middle" coordsize="2495550,349673" o:spt="100" o:gfxdata="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" adj="-11796480,,5400" path="m,l2437270,r58280,58280l2495550,349673,,349673,,xe" fillcolor="#ffc" strokecolor="#021730 [1604]" strokeweight="1.25pt">
                   <v:stroke joinstyle="miter" endcap="round"/>
                   <v:formulas/>
-                  <v:path arrowok="t" o:connecttype="custom" o:connectlocs="0,0;2431731,0;2495550,63819;2495550,382906;0,382906;0,0" o:connectangles="0,0,0,0,0,0" textboxrect="0,0,2495550,382906"/>
+                  <v:path arrowok="t" o:connecttype="custom" o:connectlocs="0,0;2437270,0;2495550,58280;2495550,349673;0,349673;0,0" o:connectangles="0,0,0,0,0,0" textboxrect="0,0,2495550,349673"/>
                   <v:textbox>
                     <w:txbxContent>
                       <w:p>
@@ -6047,25 +6111,25 @@
                           </w:numPr>
                           <w:rPr>
                             <w:color w:val="000000" w:themeColor="text1"/>
-                            <w:sz w:val="14"/>
-                            <w:szCs w:val="14"/>
+                            <w:sz w:val="12"/>
+                            <w:szCs w:val="12"/>
                             <w:lang w:val="es-MX"/>
                           </w:rPr>
                         </w:pPr>
                         <w:r>
                           <w:rPr>
                             <w:color w:val="000000" w:themeColor="text1"/>
-                            <w:sz w:val="14"/>
-                            <w:szCs w:val="14"/>
+                            <w:sz w:val="12"/>
+                            <w:szCs w:val="12"/>
                             <w:lang w:val="es-MX"/>
                           </w:rPr>
-                          <w:t>Programación de Reuniones con clientes potenciales para demostraciones</w:t>
+                          <w:t>Capacitaciones y demostraciones de uso del producto</w:t>
                         </w:r>
                         <w:r>
                           <w:rPr>
                             <w:color w:val="000000" w:themeColor="text1"/>
-                            <w:sz w:val="14"/>
-                            <w:szCs w:val="14"/>
+                            <w:sz w:val="12"/>
+                            <w:szCs w:val="12"/>
                             <w:lang w:val="es-MX"/>
                           </w:rPr>
                           <w:t>.</w:t>
@@ -6074,10 +6138,10 @@
                     </w:txbxContent>
                   </v:textbox>
                 </v:shape>
-                <v:shape id="Rectángulo: una sola esquina cortada 29" o:spid="_x0000_s1052" style="position:absolute;left:89439;top:14116;width:24956;height:4553;visibility:visible;mso-wrap-style:square;v-text-anchor:middle" coordsize="2495550,455295" o:spt="100" o:gfxdata="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" adj="-11796480,,5400" path="m,l2419666,r75884,75884l2495550,455295,,455295,,xe" fillcolor="#ffc" strokecolor="#021730 [1604]" strokeweight="1.25pt">
+                <v:shape id="Rectángulo: una sola esquina cortada 29" o:spid="_x0000_s1052" style="position:absolute;left:89535;top:11817;width:24955;height:2915;visibility:visible;mso-wrap-style:square;v-text-anchor:middle" coordsize="2495550,291465" o:spt="100" o:gfxdata="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" adj="-11796480,,5400" path="m,l2446972,r48578,48578l2495550,291465,,291465,,xe" fillcolor="#ffc" strokecolor="#021730 [1604]" strokeweight="1.25pt">
                   <v:stroke joinstyle="miter" endcap="round"/>
                   <v:formulas/>
-                  <v:path arrowok="t" o:connecttype="custom" o:connectlocs="0,0;2419666,0;2495550,75884;2495550,455295;0,455295;0,0" o:connectangles="0,0,0,0,0,0" textboxrect="0,0,2495550,455295"/>
+                  <v:path arrowok="t" o:connecttype="custom" o:connectlocs="0,0;2446972,0;2495550,48578;2495550,291465;0,291465;0,0" o:connectangles="0,0,0,0,0,0" textboxrect="0,0,2495550,291465"/>
                   <v:textbox>
                     <w:txbxContent>
                       <w:p>
@@ -6089,55 +6153,28 @@
                           </w:numPr>
                           <w:rPr>
                             <w:color w:val="000000" w:themeColor="text1"/>
-                            <w:sz w:val="20"/>
-                            <w:szCs w:val="20"/>
+                            <w:sz w:val="18"/>
+                            <w:szCs w:val="18"/>
                             <w:lang w:val="es-MX"/>
                           </w:rPr>
                         </w:pPr>
                         <w:r>
                           <w:rPr>
                             <w:color w:val="000000" w:themeColor="text1"/>
-                            <w:sz w:val="14"/>
-                            <w:szCs w:val="14"/>
+                            <w:sz w:val="12"/>
+                            <w:szCs w:val="12"/>
                             <w:lang w:val="es-MX"/>
                           </w:rPr>
-                          <w:t xml:space="preserve">Enlace con Empresas de </w:t>
-                        </w:r>
-                        <w:r>
-                          <w:rPr>
-                            <w:color w:val="000000" w:themeColor="text1"/>
-                            <w:sz w:val="14"/>
-                            <w:szCs w:val="14"/>
-                            <w:lang w:val="es-MX"/>
-                          </w:rPr>
-                          <w:t>Gestión</w:t>
-                        </w:r>
-                        <w:r>
-                          <w:rPr>
-                            <w:color w:val="000000" w:themeColor="text1"/>
-                            <w:sz w:val="14"/>
-                            <w:szCs w:val="14"/>
-                            <w:lang w:val="es-MX"/>
-                          </w:rPr>
-                          <w:t xml:space="preserve"> </w:t>
-                        </w:r>
-                        <w:r>
-                          <w:rPr>
-                            <w:color w:val="000000" w:themeColor="text1"/>
-                            <w:sz w:val="14"/>
-                            <w:szCs w:val="14"/>
-                            <w:lang w:val="es-MX"/>
-                          </w:rPr>
-                          <w:t>Medica y Asociaciones Clínicas.</w:t>
+                          <w:t>Experiencia de Usuario.</w:t>
                         </w:r>
                       </w:p>
                     </w:txbxContent>
                   </v:textbox>
                 </v:shape>
-                <v:shape id="Rectángulo: una sola esquina cortada 30" o:spid="_x0000_s1053" style="position:absolute;left:89439;top:19335;width:24956;height:4306;visibility:visible;mso-wrap-style:square;v-text-anchor:middle" coordsize="2495550,430530" o:spt="100" o:gfxdata="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" adj="-11796480,,5400" path="m,l2423794,r71756,71756l2495550,430530,,430530,,xe" fillcolor="#ffc" strokecolor="#021730 [1604]" strokeweight="1.25pt">
+                <v:shape id="Rectángulo: una sola esquina cortada 30" o:spid="_x0000_s1053" style="position:absolute;left:89566;top:15144;width:24956;height:2591;visibility:visible;mso-wrap-style:square;v-text-anchor:middle" coordsize="2495550,259080" o:spt="100" o:gfxdata="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" adj="-11796480,,5400" path="m,l2452369,r43181,43181l2495550,259080,,259080,,xe" fillcolor="#ffc" strokecolor="#021730 [1604]" strokeweight="1.25pt">
                   <v:stroke joinstyle="miter" endcap="round"/>
                   <v:formulas/>
-                  <v:path arrowok="t" o:connecttype="custom" o:connectlocs="0,0;2423794,0;2495550,71756;2495550,430530;0,430530;0,0" o:connectangles="0,0,0,0,0,0" textboxrect="0,0,2495550,430530"/>
+                  <v:path arrowok="t" o:connecttype="custom" o:connectlocs="0,0;2452369,0;2495550,43181;2495550,259080;0,259080;0,0" o:connectangles="0,0,0,0,0,0" textboxrect="0,0,2495550,259080"/>
                   <v:textbox>
                     <w:txbxContent>
                       <w:p>
@@ -6149,28 +6186,28 @@
                           </w:numPr>
                           <w:rPr>
                             <w:color w:val="000000" w:themeColor="text1"/>
-                            <w:sz w:val="16"/>
-                            <w:szCs w:val="16"/>
+                            <w:sz w:val="12"/>
+                            <w:szCs w:val="12"/>
                             <w:lang w:val="es-MX"/>
                           </w:rPr>
                         </w:pPr>
                         <w:r>
                           <w:rPr>
                             <w:color w:val="000000" w:themeColor="text1"/>
-                            <w:sz w:val="16"/>
-                            <w:szCs w:val="16"/>
+                            <w:sz w:val="12"/>
+                            <w:szCs w:val="12"/>
                             <w:lang w:val="es-MX"/>
                           </w:rPr>
-                          <w:t>Publicidad a través del sitio web</w:t>
+                          <w:t>Mantenimiento y personalización del producto</w:t>
                         </w:r>
                         <w:r>
                           <w:rPr>
                             <w:color w:val="000000" w:themeColor="text1"/>
-                            <w:sz w:val="16"/>
-                            <w:szCs w:val="16"/>
+                            <w:sz w:val="12"/>
+                            <w:szCs w:val="12"/>
                             <w:lang w:val="es-MX"/>
                           </w:rPr>
-                          <w:t xml:space="preserve"> y gestión de Marketing. </w:t>
+                          <w:t xml:space="preserve">. </w:t>
                         </w:r>
                       </w:p>
                     </w:txbxContent>
@@ -6478,7 +6515,25 @@
                             <w:szCs w:val="16"/>
                             <w:lang w:val="es-MX"/>
                           </w:rPr>
-                          <w:t>Áreas de Especialidades Medicas</w:t>
+                          <w:t xml:space="preserve">Dueños de </w:t>
+                        </w:r>
+                        <w:r>
+                          <w:rPr>
+                            <w:color w:val="000000" w:themeColor="text1"/>
+                            <w:sz w:val="16"/>
+                            <w:szCs w:val="16"/>
+                            <w:lang w:val="es-MX"/>
+                          </w:rPr>
+                          <w:t>Farmacéuticas</w:t>
+                        </w:r>
+                        <w:r>
+                          <w:rPr>
+                            <w:color w:val="000000" w:themeColor="text1"/>
+                            <w:sz w:val="16"/>
+                            <w:szCs w:val="16"/>
+                            <w:lang w:val="es-MX"/>
+                          </w:rPr>
+                          <w:t xml:space="preserve"> </w:t>
                         </w:r>
                       </w:p>
                     </w:txbxContent>
@@ -6854,16 +6909,6 @@
           <w:szCs w:val="28"/>
         </w:rPr>
       </w:pPr>
-    </w:p>
-    <w:p>
-      <w:pPr>
-        <w:spacing w:line="360" w:lineRule="auto"/>
-        <w:rPr>
-          <w:rStyle w:val="Ttulodellibro"/>
-          <w:sz w:val="28"/>
-          <w:szCs w:val="28"/>
-        </w:rPr>
-      </w:pPr>
       <w:r>
         <w:rPr>
           <w:noProof/>
@@ -6871,16 +6916,16 @@
         <mc:AlternateContent>
           <mc:Choice Requires="wps">
             <w:drawing>
-              <wp:anchor distT="0" distB="0" distL="114300" distR="114300" simplePos="0" relativeHeight="251686912" behindDoc="0" locked="0" layoutInCell="1" allowOverlap="1" wp14:anchorId="3CB933D3" wp14:editId="06C1AAAC">
+              <wp:anchor distT="0" distB="0" distL="114300" distR="114300" simplePos="0" relativeHeight="251686912" behindDoc="0" locked="0" layoutInCell="1" allowOverlap="1" wp14:anchorId="3CB933D3" wp14:editId="353D87CF">
                 <wp:simplePos x="0" y="0"/>
                 <wp:positionH relativeFrom="column">
-                  <wp:posOffset>9324763</wp:posOffset>
+                  <wp:posOffset>9333230</wp:posOffset>
                 </wp:positionH>
                 <wp:positionV relativeFrom="paragraph">
-                  <wp:posOffset>311573</wp:posOffset>
+                  <wp:posOffset>208915</wp:posOffset>
                 </wp:positionV>
-                <wp:extent cx="2495550" cy="829734"/>
-                <wp:effectExtent l="0" t="0" r="19050" b="27940"/>
+                <wp:extent cx="2495550" cy="370414"/>
+                <wp:effectExtent l="0" t="0" r="19050" b="10795"/>
                 <wp:wrapNone/>
                 <wp:docPr id="46" name="Rectángulo: una sola esquina cortada 46"/>
                 <wp:cNvGraphicFramePr/>
@@ -6891,7 +6936,7 @@
                       <wps:spPr>
                         <a:xfrm>
                           <a:off x="0" y="0"/>
-                          <a:ext cx="2495550" cy="829734"/>
+                          <a:ext cx="2495550" cy="370414"/>
                         </a:xfrm>
                         <a:prstGeom prst="snip1Rect">
                           <a:avLst/>
@@ -6928,19 +6973,28 @@
                               <w:jc w:val="both"/>
                               <w:rPr>
                                 <w:color w:val="000000" w:themeColor="text1"/>
-                                <w:sz w:val="14"/>
-                                <w:szCs w:val="14"/>
+                                <w:sz w:val="12"/>
+                                <w:szCs w:val="12"/>
                                 <w:lang w:val="es-MX"/>
                               </w:rPr>
                             </w:pPr>
                             <w:r>
                               <w:rPr>
                                 <w:color w:val="000000" w:themeColor="text1"/>
-                                <w:sz w:val="14"/>
-                                <w:szCs w:val="14"/>
+                                <w:sz w:val="12"/>
+                                <w:szCs w:val="12"/>
                                 <w:lang w:val="es-MX"/>
                               </w:rPr>
-                              <w:t xml:space="preserve">Estudio de mercado para dirigir correctamente a quien va dirigido el servicio que se prestara y ajustando precios competitivos de a los de la competencia. </w:t>
+                              <w:t>Soporte proactivo y Actualizaciones constantes</w:t>
+                            </w:r>
+                            <w:r>
+                              <w:rPr>
+                                <w:color w:val="000000" w:themeColor="text1"/>
+                                <w:sz w:val="12"/>
+                                <w:szCs w:val="12"/>
+                                <w:lang w:val="es-MX"/>
+                              </w:rPr>
+                              <w:t xml:space="preserve">. </w:t>
                             </w:r>
                           </w:p>
                         </w:txbxContent>
@@ -6962,10 +7016,10 @@
           </mc:Choice>
           <mc:Fallback>
             <w:pict>
-              <v:shape w14:anchorId="3CB933D3" id="Rectángulo: una sola esquina cortada 46" o:spid="_x0000_s1075" style="position:absolute;margin-left:734.25pt;margin-top:24.55pt;width:196.5pt;height:65.35pt;z-index:251686912;visibility:visible;mso-wrap-style:square;mso-height-percent:0;mso-wrap-distance-left:9pt;mso-wrap-distance-top:0;mso-wrap-distance-right:9pt;mso-wrap-distance-bottom:0;mso-position-horizontal:absolute;mso-position-horizontal-relative:text;mso-position-vertical:absolute;mso-position-vertical-relative:text;mso-height-percent:0;mso-height-relative:margin;v-text-anchor:middle" coordsize="2495550,829734" o:spt="100" o:gfxdata="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" adj="-11796480,,5400" path="m,l2357258,r138292,138292l2495550,829734,,829734,,xe" fillcolor="#ffc" strokecolor="#021730 [1604]" strokeweight="1.25pt">
+              <v:shape w14:anchorId="3CB933D3" id="Rectángulo: una sola esquina cortada 46" o:spid="_x0000_s1075" style="position:absolute;margin-left:734.9pt;margin-top:16.45pt;width:196.5pt;height:29.15pt;z-index:251686912;visibility:visible;mso-wrap-style:square;mso-height-percent:0;mso-wrap-distance-left:9pt;mso-wrap-distance-top:0;mso-wrap-distance-right:9pt;mso-wrap-distance-bottom:0;mso-position-horizontal:absolute;mso-position-horizontal-relative:text;mso-position-vertical:absolute;mso-position-vertical-relative:text;mso-height-percent:0;mso-height-relative:margin;v-text-anchor:middle" coordsize="2495550,370414" o:spt="100" o:gfxdata="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" adj="-11796480,,5400" path="m,l2433813,r61737,61737l2495550,370414,,370414,,xe" fillcolor="#ffc" strokecolor="#021730 [1604]" strokeweight="1.25pt">
                 <v:stroke joinstyle="miter" endcap="round"/>
                 <v:formulas/>
-                <v:path arrowok="t" o:connecttype="custom" o:connectlocs="0,0;2357258,0;2495550,138292;2495550,829734;0,829734;0,0" o:connectangles="0,0,0,0,0,0" textboxrect="0,0,2495550,829734"/>
+                <v:path arrowok="t" o:connecttype="custom" o:connectlocs="0,0;2433813,0;2495550,61737;2495550,370414;0,370414;0,0" o:connectangles="0,0,0,0,0,0" textboxrect="0,0,2495550,370414"/>
                 <v:textbox>
                   <w:txbxContent>
                     <w:p>
@@ -6978,19 +7032,28 @@
                         <w:jc w:val="both"/>
                         <w:rPr>
                           <w:color w:val="000000" w:themeColor="text1"/>
-                          <w:sz w:val="14"/>
-                          <w:szCs w:val="14"/>
+                          <w:sz w:val="12"/>
+                          <w:szCs w:val="12"/>
                           <w:lang w:val="es-MX"/>
                         </w:rPr>
                       </w:pPr>
                       <w:r>
                         <w:rPr>
                           <w:color w:val="000000" w:themeColor="text1"/>
-                          <w:sz w:val="14"/>
-                          <w:szCs w:val="14"/>
+                          <w:sz w:val="12"/>
+                          <w:szCs w:val="12"/>
                           <w:lang w:val="es-MX"/>
                         </w:rPr>
-                        <w:t xml:space="preserve">Estudio de mercado para dirigir correctamente a quien va dirigido el servicio que se prestara y ajustando precios competitivos de a los de la competencia. </w:t>
+                        <w:t>Soporte proactivo y Actualizaciones constantes</w:t>
+                      </w:r>
+                      <w:r>
+                        <w:rPr>
+                          <w:color w:val="000000" w:themeColor="text1"/>
+                          <w:sz w:val="12"/>
+                          <w:szCs w:val="12"/>
+                          <w:lang w:val="es-MX"/>
+                        </w:rPr>
+                        <w:t xml:space="preserve">. </w:t>
                       </w:r>
                     </w:p>
                   </w:txbxContent>
@@ -7000,6 +7063,16 @@
           </mc:Fallback>
         </mc:AlternateContent>
       </w:r>
+    </w:p>
+    <w:p>
+      <w:pPr>
+        <w:spacing w:line="360" w:lineRule="auto"/>
+        <w:rPr>
+          <w:rStyle w:val="Ttulodellibro"/>
+          <w:sz w:val="28"/>
+          <w:szCs w:val="28"/>
+        </w:rPr>
+      </w:pPr>
     </w:p>
     <w:p>
       <w:pPr>
@@ -7385,8 +7458,9 @@
                               <w:pStyle w:val="Prrafodelista"/>
                               <w:numPr>
                                 <w:ilvl w:val="0"/>
-                                <w:numId w:val="29"/>
+                                <w:numId w:val="40"/>
                               </w:numPr>
+                              <w:jc w:val="both"/>
                               <w:rPr>
                                 <w:color w:val="000000" w:themeColor="text1"/>
                                 <w:sz w:val="16"/>
@@ -7401,7 +7475,7 @@
                                 <w:szCs w:val="16"/>
                                 <w:lang w:val="es-MX"/>
                               </w:rPr>
-                              <w:t>Áreas de Atención Primaria</w:t>
+                              <w:t>Dueños de unidades Clínicas</w:t>
                             </w:r>
                           </w:p>
                         </w:txbxContent>
@@ -7434,8 +7508,9 @@
                         <w:pStyle w:val="Prrafodelista"/>
                         <w:numPr>
                           <w:ilvl w:val="0"/>
-                          <w:numId w:val="29"/>
+                          <w:numId w:val="40"/>
                         </w:numPr>
+                        <w:jc w:val="both"/>
                         <w:rPr>
                           <w:color w:val="000000" w:themeColor="text1"/>
                           <w:sz w:val="16"/>
@@ -7450,7 +7525,7 @@
                           <w:szCs w:val="16"/>
                           <w:lang w:val="es-MX"/>
                         </w:rPr>
-                        <w:t>Áreas de Atención Primaria</w:t>
+                        <w:t>Dueños de unidades Clínicas</w:t>
                       </w:r>
                     </w:p>
                   </w:txbxContent>
@@ -7639,7 +7714,7 @@
         <mc:AlternateContent>
           <mc:Choice Requires="wps">
             <w:drawing>
-              <wp:anchor distT="0" distB="0" distL="114300" distR="114300" simplePos="0" relativeHeight="251691008" behindDoc="0" locked="0" layoutInCell="1" allowOverlap="1" wp14:anchorId="6D378F13" wp14:editId="479E051E">
+              <wp:anchor distT="0" distB="0" distL="114300" distR="114300" simplePos="0" relativeHeight="251691008" behindDoc="0" locked="0" layoutInCell="1" allowOverlap="1" wp14:anchorId="6D378F13" wp14:editId="746509E2">
                 <wp:simplePos x="0" y="0"/>
                 <wp:positionH relativeFrom="column">
                   <wp:posOffset>12167870</wp:posOffset>
@@ -7794,6 +7869,158 @@
           <w:szCs w:val="28"/>
         </w:rPr>
       </w:pPr>
+      <w:r>
+        <w:rPr>
+          <w:noProof/>
+        </w:rPr>
+        <mc:AlternateContent>
+          <mc:Choice Requires="wps">
+            <w:drawing>
+              <wp:anchor distT="0" distB="0" distL="114300" distR="114300" simplePos="0" relativeHeight="251693056" behindDoc="0" locked="0" layoutInCell="1" allowOverlap="1" wp14:anchorId="03EA0182" wp14:editId="4C91CE29">
+                <wp:simplePos x="0" y="0"/>
+                <wp:positionH relativeFrom="column">
+                  <wp:posOffset>12170410</wp:posOffset>
+                </wp:positionH>
+                <wp:positionV relativeFrom="paragraph">
+                  <wp:posOffset>247650</wp:posOffset>
+                </wp:positionV>
+                <wp:extent cx="2495550" cy="364067"/>
+                <wp:effectExtent l="0" t="0" r="19050" b="17145"/>
+                <wp:wrapNone/>
+                <wp:docPr id="56" name="Rectángulo: una sola esquina cortada 56"/>
+                <wp:cNvGraphicFramePr/>
+                <a:graphic xmlns:a="http://schemas.openxmlformats.org/drawingml/2006/main">
+                  <a:graphicData uri="http://schemas.microsoft.com/office/word/2010/wordprocessingShape">
+                    <wps:wsp>
+                      <wps:cNvSpPr/>
+                      <wps:spPr>
+                        <a:xfrm>
+                          <a:off x="0" y="0"/>
+                          <a:ext cx="2495550" cy="364067"/>
+                        </a:xfrm>
+                        <a:prstGeom prst="snip1Rect">
+                          <a:avLst/>
+                        </a:prstGeom>
+                        <a:solidFill>
+                          <a:srgbClr val="FFFFCC"/>
+                        </a:solidFill>
+                      </wps:spPr>
+                      <wps:style>
+                        <a:lnRef idx="2">
+                          <a:schemeClr val="accent1">
+                            <a:shade val="50000"/>
+                          </a:schemeClr>
+                        </a:lnRef>
+                        <a:fillRef idx="1">
+                          <a:schemeClr val="accent1"/>
+                        </a:fillRef>
+                        <a:effectRef idx="0">
+                          <a:schemeClr val="accent1"/>
+                        </a:effectRef>
+                        <a:fontRef idx="minor">
+                          <a:schemeClr val="lt1"/>
+                        </a:fontRef>
+                      </wps:style>
+                      <wps:txbx>
+                        <w:txbxContent>
+                          <w:p>
+                            <w:pPr>
+                              <w:pStyle w:val="Prrafodelista"/>
+                              <w:numPr>
+                                <w:ilvl w:val="0"/>
+                                <w:numId w:val="29"/>
+                              </w:numPr>
+                              <w:rPr>
+                                <w:color w:val="000000" w:themeColor="text1"/>
+                                <w:sz w:val="14"/>
+                                <w:szCs w:val="14"/>
+                                <w:lang w:val="es-MX"/>
+                              </w:rPr>
+                            </w:pPr>
+                            <w:r>
+                              <w:rPr>
+                                <w:color w:val="000000" w:themeColor="text1"/>
+                                <w:sz w:val="14"/>
+                                <w:szCs w:val="14"/>
+                                <w:lang w:val="es-MX"/>
+                              </w:rPr>
+                              <w:t>Gobiernos estatales y federal dentro del área de S</w:t>
+                            </w:r>
+                            <w:r>
+                              <w:rPr>
+                                <w:color w:val="000000" w:themeColor="text1"/>
+                                <w:sz w:val="14"/>
+                                <w:szCs w:val="14"/>
+                                <w:lang w:val="es-MX"/>
+                              </w:rPr>
+                              <w:t>alud.</w:t>
+                            </w:r>
+                          </w:p>
+                        </w:txbxContent>
+                      </wps:txbx>
+                      <wps:bodyPr rot="0" spcFirstLastPara="0" vertOverflow="overflow" horzOverflow="overflow" vert="horz" wrap="square" lIns="91440" tIns="45720" rIns="91440" bIns="45720" numCol="1" spcCol="0" rtlCol="0" fromWordArt="0" anchor="ctr" anchorCtr="0" forceAA="0" compatLnSpc="1">
+                        <a:prstTxWarp prst="textNoShape">
+                          <a:avLst/>
+                        </a:prstTxWarp>
+                        <a:noAutofit/>
+                      </wps:bodyPr>
+                    </wps:wsp>
+                  </a:graphicData>
+                </a:graphic>
+                <wp14:sizeRelV relativeFrom="margin">
+                  <wp14:pctHeight>0</wp14:pctHeight>
+                </wp14:sizeRelV>
+              </wp:anchor>
+            </w:drawing>
+          </mc:Choice>
+          <mc:Fallback>
+            <w:pict>
+              <v:shape w14:anchorId="03EA0182" id="Rectángulo: una sola esquina cortada 56" o:spid="_x0000_s1081" style="position:absolute;margin-left:958.3pt;margin-top:19.5pt;width:196.5pt;height:28.65pt;z-index:251693056;visibility:visible;mso-wrap-style:square;mso-height-percent:0;mso-wrap-distance-left:9pt;mso-wrap-distance-top:0;mso-wrap-distance-right:9pt;mso-wrap-distance-bottom:0;mso-position-horizontal:absolute;mso-position-horizontal-relative:text;mso-position-vertical:absolute;mso-position-vertical-relative:text;mso-height-percent:0;mso-height-relative:margin;v-text-anchor:middle" coordsize="2495550,364067" o:spt="100" o:gfxdata="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" adj="-11796480,,5400" path="m,l2434871,r60679,60679l2495550,364067,,364067,,xe" fillcolor="#ffc" strokecolor="#021730 [1604]" strokeweight="1.25pt">
+                <v:stroke joinstyle="miter" endcap="round"/>
+                <v:formulas/>
+                <v:path arrowok="t" o:connecttype="custom" o:connectlocs="0,0;2434871,0;2495550,60679;2495550,364067;0,364067;0,0" o:connectangles="0,0,0,0,0,0" textboxrect="0,0,2495550,364067"/>
+                <v:textbox>
+                  <w:txbxContent>
+                    <w:p>
+                      <w:pPr>
+                        <w:pStyle w:val="Prrafodelista"/>
+                        <w:numPr>
+                          <w:ilvl w:val="0"/>
+                          <w:numId w:val="29"/>
+                        </w:numPr>
+                        <w:rPr>
+                          <w:color w:val="000000" w:themeColor="text1"/>
+                          <w:sz w:val="14"/>
+                          <w:szCs w:val="14"/>
+                          <w:lang w:val="es-MX"/>
+                        </w:rPr>
+                      </w:pPr>
+                      <w:r>
+                        <w:rPr>
+                          <w:color w:val="000000" w:themeColor="text1"/>
+                          <w:sz w:val="14"/>
+                          <w:szCs w:val="14"/>
+                          <w:lang w:val="es-MX"/>
+                        </w:rPr>
+                        <w:t>Gobiernos estatales y federal dentro del área de S</w:t>
+                      </w:r>
+                      <w:r>
+                        <w:rPr>
+                          <w:color w:val="000000" w:themeColor="text1"/>
+                          <w:sz w:val="14"/>
+                          <w:szCs w:val="14"/>
+                          <w:lang w:val="es-MX"/>
+                        </w:rPr>
+                        <w:t>alud.</w:t>
+                      </w:r>
+                    </w:p>
+                  </w:txbxContent>
+                </v:textbox>
+              </v:shape>
+            </w:pict>
+          </mc:Fallback>
+        </mc:AlternateContent>
+      </w:r>
     </w:p>
     <w:p>
       <w:pPr>
@@ -7815,6 +8042,7 @@
         </w:rPr>
       </w:pPr>
     </w:p>
+    <w:bookmarkEnd w:id="3"/>
     <w:p>
       <w:pPr>
         <w:spacing w:line="360" w:lineRule="auto"/>
@@ -7853,24 +8081,121 @@
           <w:szCs w:val="28"/>
         </w:rPr>
       </w:pPr>
-      <w:bookmarkStart w:id="5" w:name="_Toc178889674"/>
+      <w:bookmarkStart w:id="4" w:name="_Toc178889674"/>
       <w:r>
         <w:rPr>
           <w:rStyle w:val="Ttulodellibro"/>
           <w:sz w:val="28"/>
           <w:szCs w:val="28"/>
         </w:rPr>
-        <w:t>Usuario</w:t>
-      </w:r>
-      <w:r>
+        <w:t>Segmentos de Clientes</w:t>
+      </w:r>
+    </w:p>
+    <w:p>
+      <w:r>
+        <w:t>Dueños de unidades hospitalarias, gobernadores y jefes de estad</w:t>
+      </w:r>
+    </w:p>
+    <w:p>
+      <w:r>
+        <w:t xml:space="preserve">Profesionales de salud </w:t>
+      </w:r>
+    </w:p>
+    <w:p>
+      <w:r>
+        <w:t>Limitaciones de clientes (Sociedades y Grupos de apoyo hospitalario)</w:t>
+      </w:r>
+    </w:p>
+    <w:p>
+      <w:r>
+        <w:t>Enfermeros</w:t>
+      </w:r>
+    </w:p>
+    <w:p>
+      <w:r>
+        <w:t xml:space="preserve">Pacientes </w:t>
+      </w:r>
+    </w:p>
+    <w:p>
+      <w:r>
+        <w:t>Administrativos</w:t>
+      </w:r>
+    </w:p>
+    <w:p>
+      <w:r>
+        <w:t>Dueños de Farmacéuticas</w:t>
+      </w:r>
+    </w:p>
+    <w:p>
+      <w:r>
+        <w:t xml:space="preserve">Jefes del área de salud publica </w:t>
+      </w:r>
+    </w:p>
+    <w:p>
+      <w:r>
+        <w:t>Dirección de Unidades de Enfermería</w:t>
+      </w:r>
+    </w:p>
+    <w:p/>
+    <w:p>
+      <w:pPr>
+        <w:rPr>
+          <w:b/>
+          <w:bCs/>
+        </w:rPr>
+      </w:pPr>
+      <w:bookmarkStart w:id="5" w:name="_Hlk181708609"/>
+      <w:r>
+        <w:rPr>
+          <w:b/>
+          <w:bCs/>
+        </w:rPr>
+        <w:t xml:space="preserve">Dueños de Hospitales Privados  </w:t>
+      </w:r>
+    </w:p>
+    <w:p>
+      <w:pPr>
+        <w:jc w:val="both"/>
+      </w:pPr>
+      <w:r>
+        <w:t xml:space="preserve">El sistema se brinda para todas las instituciones de atención médica, el objetivo principal es generar una sistema de calidad mejore la calidad en la gestión hospitalario, es por ello que los dueños e inversores o sociedades hospitalarias buscan </w:t>
+      </w:r>
+      <w:r>
+        <w:t>mejoras constantes que ofrezcan un rendimiento eficaz, rápido y controlado de acuerdo a normativas y estándares establecido para el ejercicio clínico, es por ello que la actualización constante de equipos nuevos y softwares que ofrezcan un mejor diagnostico para sus clientes y pacientes, así mismo buscan estar a la vanguardia que los haga diferentes con sus competidores, el sistema que se ofrece puede ser  adaptado a las necesidades que los jefes de área necesiten para optimizar su labores.</w:t>
+      </w:r>
+    </w:p>
+    <w:p>
+      <w:pPr>
+        <w:pStyle w:val="Ttulo1"/>
+        <w:spacing w:line="360" w:lineRule="auto"/>
         <w:rPr>
           <w:rStyle w:val="Ttulodellibro"/>
           <w:sz w:val="28"/>
           <w:szCs w:val="28"/>
         </w:rPr>
+      </w:pPr>
+      <w:r>
+        <w:rPr>
+          <w:rStyle w:val="Ttulodellibro"/>
+          <w:sz w:val="28"/>
+          <w:szCs w:val="28"/>
+        </w:rPr>
+        <w:t>Usuario</w:t>
+      </w:r>
+      <w:r>
+        <w:rPr>
+          <w:rStyle w:val="Ttulodellibro"/>
+          <w:sz w:val="28"/>
+          <w:szCs w:val="28"/>
+        </w:rPr>
         <w:t>s</w:t>
       </w:r>
-      <w:bookmarkEnd w:id="5"/>
+      <w:bookmarkEnd w:id="4"/>
+    </w:p>
+    <w:p>
+      <w:r>
+        <w:t>Personal de salud</w:t>
+      </w:r>
     </w:p>
     <w:p>
       <w:pPr>
@@ -7902,7 +8227,13 @@
         <w:t xml:space="preserve"> </w:t>
       </w:r>
       <w:r>
-        <w:t>Líder equipo que tiene la responsabilidad de tomar las decisiones que afectan al cuidado del paciente, incluyendo el diagnostico y tratamiento, así como la supervisión del resto del equipo.</w:t>
+        <w:t>Líder equipo que tiene la responsabilidad de tomar las decisiones que afectan al cuidado del paciente, incluyendo el diagnostico y tratamiento, así como la supervisión del resto del equipo</w:t>
+      </w:r>
+      <w:r>
+        <w:t>, es por ello que el sistema de gestión hospitalario es dirigido para los practicantes de la medicina permitiéndole organizar sus actividades y peticiones de las áreas en las que se involucra, participando de manera colaborativa con otras áreas de especialización</w:t>
+      </w:r>
+      <w:r>
+        <w:t>.</w:t>
       </w:r>
     </w:p>
     <w:p>
@@ -7924,7 +8255,13 @@
         <w:t>é</w:t>
       </w:r>
       <w:r>
-        <w:t>dico que se encarga de problemas médicos graves para evaluar el paciente y recomiende de la mejor forma de tratar y diagnosticar los problemas médico.</w:t>
+        <w:t>dico que se encarga de problemas médicos graves para evaluar el paciente y recomiende de la mejor forma de tratar y diagnosticar los problemas médico</w:t>
+      </w:r>
+      <w:r>
+        <w:t>, con el sistema de Gestión Hospitalaria los especialistas tendrán en claro la evaluación de procedimientos quirúrgicos y tratamientos realizados por las áreas de supervisión y aprobaciones médicas, que se vinculan con él cuerpo directivo del hospital que garantice la seguridad y preservación de la salud de los pacientes tratados</w:t>
+      </w:r>
+      <w:r>
+        <w:t>.</w:t>
       </w:r>
     </w:p>
     <w:p>
@@ -7937,10 +8274,20 @@
           <w:b/>
           <w:bCs/>
         </w:rPr>
+        <w:lastRenderedPageBreak/>
         <w:t>Defensores de pacientes</w:t>
       </w:r>
       <w:r>
-        <w:t>: Miembros del personal administrativo cuya función es ayudar a los pacientes que reciben atención allí.</w:t>
+        <w:t>: Miembros del personal administrativo cuya función es ayudar a los pacientes que reciben atención allí</w:t>
+      </w:r>
+      <w:r>
+        <w:t>, de acuerdo con las peticiones generadas en el flujo de trabajo del hospital, el sistema ofrece una compilación precisa que organiza de forma estadística como la logística llevada a cabo en cada solicitud</w:t>
+      </w:r>
+      <w:r>
+        <w:t>, estos datos almacenados en la bitácora de actividades puede ser un factor primordial para mejorar los procesos de administración el ejercicio de las actividades clínicas, que permitan que los pacientes tengan una atención de calidad</w:t>
+      </w:r>
+      <w:r>
+        <w:t>.</w:t>
       </w:r>
     </w:p>
     <w:p>
@@ -7956,7 +8303,13 @@
         <w:t>Farmacéuticos Hospitalarios:</w:t>
       </w:r>
       <w:r>
-        <w:t xml:space="preserve"> Son especialistas que supervisan el huso de los fármacos en el hospital y como interactúan entre sí. </w:t>
+        <w:t xml:space="preserve"> Son especialistas que supervisan el huso de los fármacos en el hospital y como interactúan entre sí</w:t>
+      </w:r>
+      <w:r>
+        <w:t>. Cada departamento solicita insumos farmacéuticos para las actividades clínicas, sin embargo, estos insumos pueden ser solicitados dentro de la ampliación directa al inventario del hospital, generando una solicitud especifica de fármacos solicitados de las áreas solicitantes, facilitando la entrega anticipada, respondiendo la escasez de estos productos a las áreas de atención</w:t>
+      </w:r>
+      <w:r>
+        <w:t xml:space="preserve">. </w:t>
       </w:r>
     </w:p>
     <w:p>
@@ -7974,6 +8327,9 @@
       <w:r>
         <w:t xml:space="preserve"> Grupo de personas que se encargan de organizar y supervisar todo el trabajo de enfermería que se realiza en un hospital o centro médico.</w:t>
       </w:r>
+      <w:r>
+        <w:t xml:space="preserve"> Con la supervisión constante en el flujo de las actividades, el sistema de Gestión Hospitalaria, permitirá controlar el flujo de las actividades para el personal de enfermería establecido medidas anticipadas para picos altos en la atención como a la distribución de tareas en todas las áreas del hospital, permitiendo así la vigilancia constante de los pacientes y acatando así los tratamientos generados para cada uno de ellos. </w:t>
+      </w:r>
     </w:p>
     <w:p>
       <w:pPr>
@@ -7990,6 +8346,9 @@
       <w:r>
         <w:t>: Individuo que busca atención o recibe cuidados de salud, para mejorar su bienestar.</w:t>
       </w:r>
+      <w:r>
+        <w:t xml:space="preserve"> El sistema de Gestión Hospitalario, permite a los clientes o pacientes brindarles un estado claro de su salud, permitiéndoles visualizar sus estudios clínicos, citas médicas, y supervisión constante con profesionales de salud para mejorar su salud.</w:t>
+      </w:r>
     </w:p>
     <w:p>
       <w:pPr>
@@ -7997,7 +8356,13 @@
         <w:jc w:val="both"/>
       </w:pPr>
       <w:r>
-        <w:t xml:space="preserve">Familiar del Paciente: Persona restable de la toma de decisiones en caso de que el paciente no este en condiciones de hacerlo, sea que fuera menor de edad o este inconsciente.    </w:t>
+        <w:t>Familiar del Paciente: Persona restable de la toma de decisiones en caso de que el paciente no este en condiciones de hacerlo, sea que fuera menor de edad o este inconsciente.</w:t>
+      </w:r>
+      <w:r>
+        <w:t xml:space="preserve"> Los pacientes activos y registrados dentro del sistema de Gestión Hospitalario menores de edad podrán ser vinculados con su tutor asignado, que podrá observar sus estudios, citas y supervisión de tratamientos realizados. </w:t>
+      </w:r>
+      <w:r>
+        <w:t xml:space="preserve">    </w:t>
       </w:r>
     </w:p>
     <w:p>
@@ -8010,16 +8375,7 @@
           <w:b/>
           <w:bCs/>
         </w:rPr>
-        <w:t>Dirección y Gestión de Servicios Generales,</w:t>
-      </w:r>
-      <w:r>
-        <w:t xml:space="preserve"> </w:t>
-      </w:r>
-      <w:r>
-        <w:t>e</w:t>
-      </w:r>
-      <w:r>
-        <w:t>ngloba diversas áreas como:</w:t>
+        <w:t>Dirección y Gestión de Servicios Generales</w:t>
       </w:r>
     </w:p>
     <w:p>
@@ -8048,6 +8404,13 @@
       <w:r>
         <w:t xml:space="preserve">iembros que colaboran en una empresa en diferentes áreas y departamentos con el objetivo de conseguir que cada departamento trabaje las personas más adecuadas a las labores que ahí se realizan. </w:t>
       </w:r>
+      <w:r>
+        <w:t xml:space="preserve">El sistema de Gestión Hospitalaria ofrece un control en la solicitud de ingreso de nuevos empleados y usuarios, además de médicos, intermitas, especialistas, enfermeras, químicos, farmacéuticos, abogado y administradores. Permitiendo al </w:t>
+      </w:r>
+      <w:r>
+        <w:lastRenderedPageBreak/>
+        <w:t>área de Recursos Humanos observar sus operaciones realizadas, tiempos de entrada y salida, tiempo extra, como trasferencias de personal temporal, y contrataciones estacionales. Generando estadísticas que permitan medir el flujo de las actividades realizadas en cada área hospitalaria.</w:t>
+      </w:r>
     </w:p>
     <w:p>
       <w:pPr>
@@ -8071,10 +8434,23 @@
           <w:b/>
           <w:bCs/>
         </w:rPr>
+        <w:t xml:space="preserve">Dirección de </w:t>
+      </w:r>
+      <w:r>
+        <w:rPr>
+          <w:b/>
+          <w:bCs/>
+        </w:rPr>
         <w:t xml:space="preserve">Área de Calidad: </w:t>
       </w:r>
       <w:r>
-        <w:t xml:space="preserve">Establece y mantiene sistemas de gestión estandarizados que permitan garantizar las asistencia optima acorde a las necesidades de cada paciente y el cumplimiento normativo. </w:t>
+        <w:t>Establece y mantiene sistemas de gestión estandarizados que permitan garantizar las asistencia optima acorde a las necesidades de cada paciente y el cumplimiento normativo.</w:t>
+      </w:r>
+      <w:r>
+        <w:t xml:space="preserve"> Junto al área de Recursos Humanos el sistema de Gestión Hospitalaria permitirá visualizar los resultados en los procedimientos atendidos, en espera, demorados o cancelados, que involucran al personal de salud (Médicos, Especialistas, Enfermeras, Químicos y Farmacéuticos), que brindan sus servicios al paciente, como unidades de logística y entrega de Insumos,</w:t>
+      </w:r>
+      <w:r>
+        <w:t xml:space="preserve"> equipos de gabinete y laboratorio, como el área de mantenimiento que se encarga de que la infraestructura hospitalaria sea optima y segura para los procedimientos realizados en la institución hospitalaria.</w:t>
       </w:r>
     </w:p>
     <w:p>
@@ -8098,58 +8474,36 @@
           <w:b/>
           <w:bCs/>
         </w:rPr>
+        <w:t xml:space="preserve">Área de </w:t>
+      </w:r>
+      <w:r>
+        <w:rPr>
+          <w:b/>
+          <w:bCs/>
+        </w:rPr>
         <w:t xml:space="preserve">Dirección Económica: </w:t>
       </w:r>
       <w:r>
-        <w:t>Dirige el ansias económico, financiero y actuariales sobre el impacto que tiene la pobreza en la salud, para proponer políticas de salud que distribuya su efecto; al igual se encarga de definir las temáticas sobre el análisis de la oferta y la demanda.</w:t>
-      </w:r>
-    </w:p>
-    <w:p>
-      <w:pPr>
-        <w:pStyle w:val="Prrafodelista"/>
-        <w:spacing w:line="360" w:lineRule="auto"/>
-      </w:pPr>
-    </w:p>
-    <w:p>
-      <w:pPr>
-        <w:pStyle w:val="Prrafodelista"/>
-        <w:numPr>
-          <w:ilvl w:val="0"/>
-          <w:numId w:val="23"/>
-        </w:numPr>
+        <w:t>Dirige el</w:t>
+      </w:r>
+      <w:r>
+        <w:t xml:space="preserve"> análisis</w:t>
+      </w:r>
+      <w:r>
+        <w:t xml:space="preserve"> económico, financiero y actuariales</w:t>
+      </w:r>
+      <w:r>
+        <w:t>, en las operaciones Hospitalarias, Con el sistema de Gestión Hospitalario la unidad clínica estará en análisis constante de las actividades realizadas, permitiéndoles hacer pronósticos en el consumo de insumos clínicos, mantenimiento de las instalaciones, flujo de actividades del personal que labora en la institución, y registros de pacientes entrantes, permitiendo evaluar los ingresos con datos visualizados en tiempo real y cronológico.</w:t>
+      </w:r>
+    </w:p>
+    <w:p>
+      <w:pPr>
         <w:spacing w:line="360" w:lineRule="auto"/>
         <w:jc w:val="both"/>
-      </w:pPr>
-      <w:r>
         <w:rPr>
           <w:b/>
           <w:bCs/>
         </w:rPr>
-        <w:t>Dirección Administrativa</w:t>
-      </w:r>
-      <w:r>
-        <w:t xml:space="preserve">: Se encarga de </w:t>
-      </w:r>
-      <w:r>
-        <w:t>c</w:t>
-      </w:r>
-      <w:r>
-        <w:t xml:space="preserve">oordinar los horarios de trabajo de los proveedores de </w:t>
-      </w:r>
-      <w:r>
-        <w:t>atención</w:t>
-      </w:r>
-      <w:r>
-        <w:t xml:space="preserve"> </w:t>
-      </w:r>
-      <w:r>
-        <w:t>y otros empleados, administrar las finanzas, mantener los historiales médicos de los pacientes, tramitar la reclamación de las compañías de seguro, mejorar la calidad y la eficiencia de la atención del paciente.</w:t>
-      </w:r>
-    </w:p>
-    <w:p>
-      <w:pPr>
-        <w:pStyle w:val="Prrafodelista"/>
-        <w:spacing w:line="360" w:lineRule="auto"/>
       </w:pPr>
     </w:p>
     <w:p>
@@ -8161,22 +8515,11 @@
           <w:bCs/>
         </w:rPr>
       </w:pPr>
-    </w:p>
-    <w:p>
-      <w:pPr>
-        <w:spacing w:line="360" w:lineRule="auto"/>
-        <w:jc w:val="both"/>
+      <w:r>
         <w:rPr>
           <w:b/>
           <w:bCs/>
         </w:rPr>
-      </w:pPr>
-      <w:r>
-        <w:rPr>
-          <w:b/>
-          <w:bCs/>
-        </w:rPr>
-        <w:lastRenderedPageBreak/>
         <w:t xml:space="preserve">Proveedores de Servicios Médicos: </w:t>
       </w:r>
     </w:p>
@@ -8206,6 +8549,16 @@
       <w:r>
         <w:t>.</w:t>
       </w:r>
+      <w:r>
+        <w:t xml:space="preserve"> El sistema de Gestión Hospitalaria se vincula con la operación de administración de fármacos y suministros clínicos que pueden ser asociados directamente en el área de logística con los hospitales para el surtimiento de sus productos, permitiendo mejorar la sociedad entre los hospitales y las farmacéuticas</w:t>
+      </w:r>
+    </w:p>
+    <w:p>
+      <w:pPr>
+        <w:pStyle w:val="Prrafodelista"/>
+        <w:spacing w:line="360" w:lineRule="auto"/>
+        <w:jc w:val="both"/>
+      </w:pPr>
     </w:p>
     <w:p>
       <w:pPr>
@@ -8240,6 +8593,23 @@
       <w:r>
         <w:t>.</w:t>
       </w:r>
+      <w:r>
+        <w:t xml:space="preserve"> Al igual que las farmacéuticas el sistema d Gestión Hospitalaria</w:t>
+      </w:r>
+      <w:r>
+        <w:t xml:space="preserve"> puede ser vinculado con la recepción de estudios clínicos realizados dentro de las instalaciones hospitalarias y analizados en los </w:t>
+      </w:r>
+      <w:r>
+        <w:lastRenderedPageBreak/>
+        <w:t>laboratorios asociados, manejado los resultados a través de la plataforma para su análisis por tare de los de paramentos de consulta y especialidad clínica, como del paciente.</w:t>
+      </w:r>
+    </w:p>
+    <w:p>
+      <w:pPr>
+        <w:pStyle w:val="Prrafodelista"/>
+        <w:spacing w:line="360" w:lineRule="auto"/>
+        <w:jc w:val="both"/>
+      </w:pPr>
     </w:p>
     <w:p>
       <w:pPr>
@@ -8299,11 +8669,14 @@
         <w:t>etc.</w:t>
       </w:r>
       <w:r>
-        <w:t>)</w:t>
-      </w:r>
-      <w:r>
-        <w:t>.</w:t>
-      </w:r>
+        <w:t xml:space="preserve">), el sistema de Gestión Hospitalaria   podrá hacer peticiones a los proveedores de suministros de manera directa, de acuerdo con las asociaciones realizadas por el hospital o centros de atención clínica. </w:t>
+      </w:r>
+    </w:p>
+    <w:p>
+      <w:pPr>
+        <w:spacing w:line="360" w:lineRule="auto"/>
+        <w:jc w:val="both"/>
+      </w:pPr>
     </w:p>
     <w:p>
       <w:pPr>
@@ -8426,6 +8799,7 @@
       </w:r>
       <w:bookmarkStart w:id="6" w:name="_Toc178889675"/>
     </w:p>
+    <w:bookmarkEnd w:id="5"/>
     <w:p>
       <w:pPr>
         <w:spacing w:line="360" w:lineRule="auto"/>
@@ -8518,7 +8892,6 @@
           <w:sz w:val="28"/>
           <w:szCs w:val="28"/>
         </w:rPr>
-        <w:lastRenderedPageBreak/>
         <w:t>Valor Agregado</w:t>
       </w:r>
       <w:bookmarkEnd w:id="6"/>
@@ -8765,7 +9138,6 @@
           <w:szCs w:val="21"/>
           <w:lang w:eastAsia="en-US"/>
         </w:rPr>
-        <w:lastRenderedPageBreak/>
         <w:t>Supervisión Remota de Procesos Operativos:</w:t>
       </w:r>
       <w:r>
@@ -9267,7 +9639,6 @@
           <w:highlight w:val="cyan"/>
           <w:lang w:eastAsia="en-US"/>
         </w:rPr>
-        <w:lastRenderedPageBreak/>
         <w:t>Respuesta Rápida ante Contingencias</w:t>
       </w:r>
       <w:r>
@@ -9651,6 +10022,7 @@
           <w:szCs w:val="21"/>
           <w:lang w:eastAsia="en-US"/>
         </w:rPr>
+        <w:lastRenderedPageBreak/>
         <w:t xml:space="preserve">Además de la supervisión operativa, la app ofrece la posibilidad de </w:t>
       </w:r>
       <w:r>
@@ -9699,7 +10071,6 @@
           <w:highlight w:val="cyan"/>
           <w:lang w:eastAsia="en-US"/>
         </w:rPr>
-        <w:lastRenderedPageBreak/>
         <w:t>funcionalidad facilita una planificación presupuestaria eficiente</w:t>
       </w:r>
       <w:r>
@@ -9903,6 +10274,7 @@
         <w:jc w:val="both"/>
       </w:pPr>
       <w:r>
+        <w:lastRenderedPageBreak/>
         <w:t xml:space="preserve">Todas las instituciones de salud interesadas pueden solicitar una demostración, o podrán consultar más información con nuestro equipo de </w:t>
       </w:r>
       <w:r>
@@ -9924,7 +10296,6 @@
         <w:jc w:val="both"/>
       </w:pPr>
       <w:r>
-        <w:lastRenderedPageBreak/>
         <w:t>La Aplicación de Gestión</w:t>
       </w:r>
       <w:r>
@@ -10028,7 +10399,6 @@
           <w:sz w:val="22"/>
           <w:szCs w:val="22"/>
         </w:rPr>
-        <w:lastRenderedPageBreak/>
         <w:t>RELACIÓN CON LOS CLIENTES</w:t>
       </w:r>
     </w:p>
@@ -10059,22 +10429,37 @@
         <w:jc w:val="both"/>
       </w:pPr>
       <w:r>
+        <w:rPr>
+          <w:highlight w:val="yellow"/>
+        </w:rPr>
         <w:t>Co</w:t>
       </w:r>
       <w:r>
+        <w:rPr>
+          <w:highlight w:val="yellow"/>
+        </w:rPr>
         <w:t>n la Aplicación Móvil,</w:t>
       </w:r>
       <w:r>
+        <w:rPr>
+          <w:highlight w:val="yellow"/>
+        </w:rPr>
         <w:t xml:space="preserve"> los </w:t>
       </w:r>
       <w:r>
-        <w:t xml:space="preserve">directores </w:t>
-      </w:r>
-      <w:r>
-        <w:t xml:space="preserve">y supervisores de cada área </w:t>
-      </w:r>
-      <w:r>
-        <w:t>pueden ver en tiempo real no solo lo que está pasando, sino quién está detrás de cada operación y decisión. Por ejemplo, si la jefa de Recursos Humanos, Laura, necesita contratar a un nuevo enfermero con urgencia, puede hacer la solicitud en el sistema y recibir la aprobación de inmediato, sin tener que pasar por largos procesos burocráticos.</w:t>
+        <w:rPr>
+          <w:highlight w:val="yellow"/>
+        </w:rPr>
+        <w:t xml:space="preserve">directores y supervisores de cada área </w:t>
+      </w:r>
+      <w:r>
+        <w:rPr>
+          <w:highlight w:val="yellow"/>
+        </w:rPr>
+        <w:t>pueden ver en tiempo real no solo lo que está pasando, sino quién está detrás de cada operación y decisión.</w:t>
+      </w:r>
+      <w:r>
+        <w:t xml:space="preserve"> Por ejemplo, si la jefa de Recursos Humanos, Laura, necesita contratar a un nuevo enfermero con urgencia, puede hacer la solicitud en el sistema y recibir la aprobación de inmediato, sin tener que pasar por largos procesos burocráticos.</w:t>
       </w:r>
     </w:p>
     <w:p>
@@ -10101,7 +10486,13 @@
         <w:jc w:val="both"/>
       </w:pPr>
       <w:r>
-        <w:t>Un ejemplo claro sería una emergencia como la llegada masiva de pacientes después de un accidente grave en la ciudad. Antes, habría sido un caos intentar coordinar a todos, pero ahora, con nuestra app, la Dirección General puede coordinarse fácilmente con las áreas de Urgencias, Quirófanos y Logística, asegurándose de que cada paciente reciba atención inmediata sin comprometer los recursos.</w:t>
+        <w:t xml:space="preserve">Un ejemplo claro sería una emergencia como la llegada masiva de pacientes después de un accidente grave en la ciudad. Antes, habría sido un caos intentar coordinar a todos, pero ahora, </w:t>
+      </w:r>
+      <w:r>
+        <w:rPr>
+          <w:highlight w:val="yellow"/>
+        </w:rPr>
+        <w:t>con nuestra app, la Dirección General puede coordinarse fácilmente con las áreas de Urgencias, Quirófanos y Logística, asegurándose de que cada paciente reciba atención inmediata sin comprometer los recursos.</w:t>
       </w:r>
     </w:p>
     <w:p>
@@ -10110,7 +10501,11 @@
         <w:jc w:val="both"/>
       </w:pPr>
       <w:r>
-        <w:t>Otro punto es la relación directa con los proveedores. La app permite verificar si ciertos suministros médicos ya han sido solicitados y si están en camino. Por ejemplo, si a mitad de la jornada laboral descubren que los monitores cardíacos están a punto de agotarse, el director puede rápidamente consultar si ya están en proceso de entrega o si necesitan hacer un pedido urgente. De esta forma, el personal médico nunca se queda sin los materiales necesarios.</w:t>
+        <w:t xml:space="preserve">Otro punto es la relación directa con los proveedores. La app permite verificar si ciertos suministros médicos ya han sido solicitados y si están en camino. Por ejemplo, si a mitad de la jornada laboral descubren que los monitores cardíacos están a punto de agotarse, el director puede rápidamente </w:t>
+      </w:r>
+      <w:r>
+        <w:lastRenderedPageBreak/>
+        <w:t>consultar si ya están en proceso de entrega o si necesitan hacer un pedido urgente. De esta forma, el personal médico nunca se queda sin los materiales necesarios.</w:t>
       </w:r>
     </w:p>
     <w:p>
@@ -10119,12 +10514,21 @@
         <w:jc w:val="both"/>
       </w:pPr>
       <w:r>
+        <w:rPr>
+          <w:highlight w:val="yellow"/>
+        </w:rPr>
         <w:t xml:space="preserve">La </w:t>
       </w:r>
       <w:r>
+        <w:rPr>
+          <w:highlight w:val="yellow"/>
+        </w:rPr>
         <w:t>Aplicación Móvil</w:t>
       </w:r>
       <w:r>
+        <w:rPr>
+          <w:highlight w:val="yellow"/>
+        </w:rPr>
         <w:t xml:space="preserve"> no solo mejora la eficiencia operativa, sino que también mantiene a todos conectados y bien informados, lo que resulta en una atención más rápida, organizada y de mayor calidad.</w:t>
       </w:r>
     </w:p>
@@ -10142,7 +10546,6 @@
           <w:sz w:val="20"/>
           <w:szCs w:val="20"/>
         </w:rPr>
-        <w:lastRenderedPageBreak/>
         <w:t>Asistencia Personalizada y Soporte Técnico</w:t>
       </w:r>
     </w:p>
@@ -10161,22 +10564,43 @@
         <w:jc w:val="both"/>
       </w:pPr>
       <w:r>
+        <w:rPr>
+          <w:highlight w:val="yellow"/>
+        </w:rPr>
         <w:t>La asistencia y supervisión de correcto funcionamiento de la aplicación Móvil es nuestra prioridad, respondiendo y atendiendo de manera oportuna las dudas surgidas en la operación y en la lectura de la información dada</w:t>
       </w:r>
       <w:r>
+        <w:rPr>
+          <w:highlight w:val="yellow"/>
+        </w:rPr>
         <w:t>, para ello se plantea una asistencia personalizada que permita a nuestros clientes entender la funcionalidad de esta tecnología, para ellos se utilizan recursos digitales como son Chat, Video Conferencia,</w:t>
       </w:r>
       <w:r>
+        <w:rPr>
+          <w:highlight w:val="yellow"/>
+        </w:rPr>
         <w:t xml:space="preserve"> </w:t>
       </w:r>
       <w:r>
+        <w:rPr>
+          <w:highlight w:val="yellow"/>
+        </w:rPr>
         <w:t>telefónica y Email, así como una asistencia dedicada a la implementación inicial y personalizada según las necesidades de cada departament</w:t>
       </w:r>
       <w:r>
+        <w:rPr>
+          <w:highlight w:val="yellow"/>
+        </w:rPr>
         <w:t>o</w:t>
       </w:r>
       <w:r>
-        <w:t xml:space="preserve"> o modulo hospitalario. Como actualizaciones frecuentes y regulares que permitan hacer un mantenimiento preventivo y correctivo ante cualquier escenario, esto asegura que la plataforma este en uso en todo momento.</w:t>
+        <w:rPr>
+          <w:highlight w:val="yellow"/>
+        </w:rPr>
+        <w:t xml:space="preserve"> o modulo hospitalario.</w:t>
+      </w:r>
+      <w:r>
+        <w:t xml:space="preserve"> Como actualizaciones frecuentes y regulares que permitan hacer un mantenimiento preventivo y correctivo ante cualquier escenario, esto asegura que la plataforma este en uso en todo momento.</w:t>
       </w:r>
     </w:p>
     <w:p>
@@ -10269,7 +10693,11 @@
         <w:jc w:val="both"/>
       </w:pPr>
       <w:r>
-        <w:t xml:space="preserve">En coordinación con el área representante legal y operativa de la institución hospitalaria se espera crear una relación a largo plazo que proporcione mejoras continuas y adaptaciones a las necesidades de la administración hospitalaria. Para ello se pretende realizar un análisis estratégico que permita dar una retroalimentación constante y mejorar según los desafíos que surjan en la implementación de la aplicación Móvil. Para esto se pretende manejar un versionamiento que permita filtrar las nuevas implementaciones, lo que </w:t>
+        <w:t xml:space="preserve">En coordinación con el área representante legal y operativa de la institución hospitalaria se espera crear una relación a largo plazo que proporcione mejoras continuas y adaptaciones a las necesidades de la administración hospitalaria. Para ello se pretende realizar un análisis estratégico que permita dar una </w:t>
+      </w:r>
+      <w:r>
+        <w:lastRenderedPageBreak/>
+        <w:t xml:space="preserve">retroalimentación constante y mejorar según los desafíos que surjan en la implementación de la aplicación Móvil. Para esto se pretende manejar un versionamiento que permita filtrar las nuevas implementaciones, lo que </w:t>
       </w:r>
       <w:r>
         <w:t>generar</w:t>
@@ -10428,6 +10856,7 @@
         <w:jc w:val="both"/>
       </w:pPr>
       <w:r>
+        <w:lastRenderedPageBreak/>
         <w:t>Para los clientes que tenemos de cartera ofrecemos planes y subscripciones, como promociones exclusivas que no les genere gastos excesivos y garantice la confianza de que con nosotros su aplicación funcionar</w:t>
       </w:r>
       <w:r>
@@ -10463,7 +10892,6 @@
           <w:sz w:val="20"/>
           <w:szCs w:val="20"/>
         </w:rPr>
-        <w:lastRenderedPageBreak/>
         <w:t>Soporte Proactivo</w:t>
       </w:r>
     </w:p>
@@ -11666,6 +12094,119 @@
     </w:lvl>
   </w:abstractNum>
   <w:abstractNum w:abstractNumId="7" w15:restartNumberingAfterBreak="0">
+    <w:nsid w:val="193F3D98"/>
+    <w:multiLevelType w:val="hybridMultilevel"/>
+    <w:tmpl w:val="572CC988"/>
+    <w:lvl w:ilvl="0" w:tplc="080A0001">
+      <w:start w:val="1"/>
+      <w:numFmt w:val="bullet"/>
+      <w:lvlText w:val=""/>
+      <w:lvlJc w:val="left"/>
+      <w:pPr>
+        <w:ind w:left="720" w:hanging="360"/>
+      </w:pPr>
+      <w:rPr>
+        <w:rFonts w:ascii="Symbol" w:hAnsi="Symbol" w:hint="default"/>
+      </w:rPr>
+    </w:lvl>
+    <w:lvl w:ilvl="1" w:tplc="080A0003" w:tentative="1">
+      <w:start w:val="1"/>
+      <w:numFmt w:val="bullet"/>
+      <w:lvlText w:val="o"/>
+      <w:lvlJc w:val="left"/>
+      <w:pPr>
+        <w:ind w:left="1440" w:hanging="360"/>
+      </w:pPr>
+      <w:rPr>
+        <w:rFonts w:ascii="Courier New" w:hAnsi="Courier New" w:cs="Courier New" w:hint="default"/>
+      </w:rPr>
+    </w:lvl>
+    <w:lvl w:ilvl="2" w:tplc="080A0005" w:tentative="1">
+      <w:start w:val="1"/>
+      <w:numFmt w:val="bullet"/>
+      <w:lvlText w:val=""/>
+      <w:lvlJc w:val="left"/>
+      <w:pPr>
+        <w:ind w:left="2160" w:hanging="360"/>
+      </w:pPr>
+      <w:rPr>
+        <w:rFonts w:ascii="Wingdings" w:hAnsi="Wingdings" w:hint="default"/>
+      </w:rPr>
+    </w:lvl>
+    <w:lvl w:ilvl="3" w:tplc="080A0001" w:tentative="1">
+      <w:start w:val="1"/>
+      <w:numFmt w:val="bullet"/>
+      <w:lvlText w:val=""/>
+      <w:lvlJc w:val="left"/>
+      <w:pPr>
+        <w:ind w:left="2880" w:hanging="360"/>
+      </w:pPr>
+      <w:rPr>
+        <w:rFonts w:ascii="Symbol" w:hAnsi="Symbol" w:hint="default"/>
+      </w:rPr>
+    </w:lvl>
+    <w:lvl w:ilvl="4" w:tplc="080A0003" w:tentative="1">
+      <w:start w:val="1"/>
+      <w:numFmt w:val="bullet"/>
+      <w:lvlText w:val="o"/>
+      <w:lvlJc w:val="left"/>
+      <w:pPr>
+        <w:ind w:left="3600" w:hanging="360"/>
+      </w:pPr>
+      <w:rPr>
+        <w:rFonts w:ascii="Courier New" w:hAnsi="Courier New" w:cs="Courier New" w:hint="default"/>
+      </w:rPr>
+    </w:lvl>
+    <w:lvl w:ilvl="5" w:tplc="080A0005" w:tentative="1">
+      <w:start w:val="1"/>
+      <w:numFmt w:val="bullet"/>
+      <w:lvlText w:val=""/>
+      <w:lvlJc w:val="left"/>
+      <w:pPr>
+        <w:ind w:left="4320" w:hanging="360"/>
+      </w:pPr>
+      <w:rPr>
+        <w:rFonts w:ascii="Wingdings" w:hAnsi="Wingdings" w:hint="default"/>
+      </w:rPr>
+    </w:lvl>
+    <w:lvl w:ilvl="6" w:tplc="080A0001" w:tentative="1">
+      <w:start w:val="1"/>
+      <w:numFmt w:val="bullet"/>
+      <w:lvlText w:val=""/>
+      <w:lvlJc w:val="left"/>
+      <w:pPr>
+        <w:ind w:left="5040" w:hanging="360"/>
+      </w:pPr>
+      <w:rPr>
+        <w:rFonts w:ascii="Symbol" w:hAnsi="Symbol" w:hint="default"/>
+      </w:rPr>
+    </w:lvl>
+    <w:lvl w:ilvl="7" w:tplc="080A0003" w:tentative="1">
+      <w:start w:val="1"/>
+      <w:numFmt w:val="bullet"/>
+      <w:lvlText w:val="o"/>
+      <w:lvlJc w:val="left"/>
+      <w:pPr>
+        <w:ind w:left="5760" w:hanging="360"/>
+      </w:pPr>
+      <w:rPr>
+        <w:rFonts w:ascii="Courier New" w:hAnsi="Courier New" w:cs="Courier New" w:hint="default"/>
+      </w:rPr>
+    </w:lvl>
+    <w:lvl w:ilvl="8" w:tplc="080A0005" w:tentative="1">
+      <w:start w:val="1"/>
+      <w:numFmt w:val="bullet"/>
+      <w:lvlText w:val=""/>
+      <w:lvlJc w:val="left"/>
+      <w:pPr>
+        <w:ind w:left="6480" w:hanging="360"/>
+      </w:pPr>
+      <w:rPr>
+        <w:rFonts w:ascii="Wingdings" w:hAnsi="Wingdings" w:hint="default"/>
+      </w:rPr>
+    </w:lvl>
+  </w:abstractNum>
+  <w:abstractNum w:abstractNumId="8" w15:restartNumberingAfterBreak="0">
     <w:nsid w:val="1B670092"/>
     <w:multiLevelType w:val="multilevel"/>
     <w:tmpl w:val="3DD6CD7E"/>
@@ -11782,7 +12323,7 @@
       </w:pPr>
     </w:lvl>
   </w:abstractNum>
-  <w:abstractNum w:abstractNumId="8" w15:restartNumberingAfterBreak="0">
+  <w:abstractNum w:abstractNumId="9" w15:restartNumberingAfterBreak="0">
     <w:nsid w:val="21487CCA"/>
     <w:multiLevelType w:val="hybridMultilevel"/>
     <w:tmpl w:val="30EC3C22"/>
@@ -11895,7 +12436,7 @@
       </w:rPr>
     </w:lvl>
   </w:abstractNum>
-  <w:abstractNum w:abstractNumId="9" w15:restartNumberingAfterBreak="0">
+  <w:abstractNum w:abstractNumId="10" w15:restartNumberingAfterBreak="0">
     <w:nsid w:val="27AD4057"/>
     <w:multiLevelType w:val="hybridMultilevel"/>
     <w:tmpl w:val="29FE42B6"/>
@@ -12007,7 +12548,7 @@
       </w:rPr>
     </w:lvl>
   </w:abstractNum>
-  <w:abstractNum w:abstractNumId="10" w15:restartNumberingAfterBreak="0">
+  <w:abstractNum w:abstractNumId="11" w15:restartNumberingAfterBreak="0">
     <w:nsid w:val="287C68F6"/>
     <w:multiLevelType w:val="hybridMultilevel"/>
     <w:tmpl w:val="E54071B2"/>
@@ -12120,7 +12661,7 @@
       </w:rPr>
     </w:lvl>
   </w:abstractNum>
-  <w:abstractNum w:abstractNumId="11" w15:restartNumberingAfterBreak="0">
+  <w:abstractNum w:abstractNumId="12" w15:restartNumberingAfterBreak="0">
     <w:nsid w:val="2C382C52"/>
     <w:multiLevelType w:val="hybridMultilevel"/>
     <w:tmpl w:val="E8861AC6"/>
@@ -12233,7 +12774,7 @@
       </w:rPr>
     </w:lvl>
   </w:abstractNum>
-  <w:abstractNum w:abstractNumId="12" w15:restartNumberingAfterBreak="0">
+  <w:abstractNum w:abstractNumId="13" w15:restartNumberingAfterBreak="0">
     <w:nsid w:val="2C9B7C7F"/>
     <w:multiLevelType w:val="hybridMultilevel"/>
     <w:tmpl w:val="EF5EA4D0"/>
@@ -12346,7 +12887,7 @@
       </w:rPr>
     </w:lvl>
   </w:abstractNum>
-  <w:abstractNum w:abstractNumId="13" w15:restartNumberingAfterBreak="0">
+  <w:abstractNum w:abstractNumId="14" w15:restartNumberingAfterBreak="0">
     <w:nsid w:val="31F07E02"/>
     <w:multiLevelType w:val="hybridMultilevel"/>
     <w:tmpl w:val="C2084DD4"/>
@@ -12459,7 +13000,7 @@
       </w:rPr>
     </w:lvl>
   </w:abstractNum>
-  <w:abstractNum w:abstractNumId="14" w15:restartNumberingAfterBreak="0">
+  <w:abstractNum w:abstractNumId="15" w15:restartNumberingAfterBreak="0">
     <w:nsid w:val="343D4653"/>
     <w:multiLevelType w:val="hybridMultilevel"/>
     <w:tmpl w:val="3E9AFA60"/>
@@ -12572,7 +13113,7 @@
       </w:rPr>
     </w:lvl>
   </w:abstractNum>
-  <w:abstractNum w:abstractNumId="15" w15:restartNumberingAfterBreak="0">
+  <w:abstractNum w:abstractNumId="16" w15:restartNumberingAfterBreak="0">
     <w:nsid w:val="34F13DCE"/>
     <w:multiLevelType w:val="hybridMultilevel"/>
     <w:tmpl w:val="5AB64B22"/>
@@ -12658,7 +13199,7 @@
       </w:pPr>
     </w:lvl>
   </w:abstractNum>
-  <w:abstractNum w:abstractNumId="16" w15:restartNumberingAfterBreak="0">
+  <w:abstractNum w:abstractNumId="17" w15:restartNumberingAfterBreak="0">
     <w:nsid w:val="357917F2"/>
     <w:multiLevelType w:val="hybridMultilevel"/>
     <w:tmpl w:val="F7504286"/>
@@ -12747,7 +13288,7 @@
       </w:pPr>
     </w:lvl>
   </w:abstractNum>
-  <w:abstractNum w:abstractNumId="17" w15:restartNumberingAfterBreak="0">
+  <w:abstractNum w:abstractNumId="18" w15:restartNumberingAfterBreak="0">
     <w:nsid w:val="381408DE"/>
     <w:multiLevelType w:val="hybridMultilevel"/>
     <w:tmpl w:val="AB48542A"/>
@@ -12860,7 +13401,7 @@
       </w:rPr>
     </w:lvl>
   </w:abstractNum>
-  <w:abstractNum w:abstractNumId="18" w15:restartNumberingAfterBreak="0">
+  <w:abstractNum w:abstractNumId="19" w15:restartNumberingAfterBreak="0">
     <w:nsid w:val="3CFB3478"/>
     <w:multiLevelType w:val="hybridMultilevel"/>
     <w:tmpl w:val="5F8AAAEE"/>
@@ -13000,7 +13541,7 @@
       </w:rPr>
     </w:lvl>
   </w:abstractNum>
-  <w:abstractNum w:abstractNumId="19" w15:restartNumberingAfterBreak="0">
+  <w:abstractNum w:abstractNumId="20" w15:restartNumberingAfterBreak="0">
     <w:nsid w:val="3E6C7C89"/>
     <w:multiLevelType w:val="hybridMultilevel"/>
     <w:tmpl w:val="D2DAB0DA"/>
@@ -13113,7 +13654,7 @@
       </w:rPr>
     </w:lvl>
   </w:abstractNum>
-  <w:abstractNum w:abstractNumId="20" w15:restartNumberingAfterBreak="0">
+  <w:abstractNum w:abstractNumId="21" w15:restartNumberingAfterBreak="0">
     <w:nsid w:val="432F13CC"/>
     <w:multiLevelType w:val="hybridMultilevel"/>
     <w:tmpl w:val="6846DB36"/>
@@ -13226,7 +13767,7 @@
       </w:rPr>
     </w:lvl>
   </w:abstractNum>
-  <w:abstractNum w:abstractNumId="21" w15:restartNumberingAfterBreak="0">
+  <w:abstractNum w:abstractNumId="22" w15:restartNumberingAfterBreak="0">
     <w:nsid w:val="44DF6652"/>
     <w:multiLevelType w:val="hybridMultilevel"/>
     <w:tmpl w:val="F0B8446E"/>
@@ -13315,7 +13856,7 @@
       </w:pPr>
     </w:lvl>
   </w:abstractNum>
-  <w:abstractNum w:abstractNumId="22" w15:restartNumberingAfterBreak="0">
+  <w:abstractNum w:abstractNumId="23" w15:restartNumberingAfterBreak="0">
     <w:nsid w:val="45D40CA5"/>
     <w:multiLevelType w:val="multilevel"/>
     <w:tmpl w:val="8D9877E6"/>
@@ -13464,7 +14005,7 @@
       </w:rPr>
     </w:lvl>
   </w:abstractNum>
-  <w:abstractNum w:abstractNumId="23" w15:restartNumberingAfterBreak="0">
+  <w:abstractNum w:abstractNumId="24" w15:restartNumberingAfterBreak="0">
     <w:nsid w:val="464930DA"/>
     <w:multiLevelType w:val="multilevel"/>
     <w:tmpl w:val="92AC640A"/>
@@ -13613,7 +14154,7 @@
       </w:rPr>
     </w:lvl>
   </w:abstractNum>
-  <w:abstractNum w:abstractNumId="24" w15:restartNumberingAfterBreak="0">
+  <w:abstractNum w:abstractNumId="25" w15:restartNumberingAfterBreak="0">
     <w:nsid w:val="48837BB1"/>
     <w:multiLevelType w:val="hybridMultilevel"/>
     <w:tmpl w:val="1BDAE962"/>
@@ -13726,7 +14267,7 @@
       </w:rPr>
     </w:lvl>
   </w:abstractNum>
-  <w:abstractNum w:abstractNumId="25" w15:restartNumberingAfterBreak="0">
+  <w:abstractNum w:abstractNumId="26" w15:restartNumberingAfterBreak="0">
     <w:nsid w:val="4A4C02B0"/>
     <w:multiLevelType w:val="hybridMultilevel"/>
     <w:tmpl w:val="60E836EA"/>
@@ -13815,7 +14356,7 @@
       </w:pPr>
     </w:lvl>
   </w:abstractNum>
-  <w:abstractNum w:abstractNumId="26" w15:restartNumberingAfterBreak="0">
+  <w:abstractNum w:abstractNumId="27" w15:restartNumberingAfterBreak="0">
     <w:nsid w:val="51306F08"/>
     <w:multiLevelType w:val="hybridMultilevel"/>
     <w:tmpl w:val="B9245396"/>
@@ -13928,7 +14469,7 @@
       </w:rPr>
     </w:lvl>
   </w:abstractNum>
-  <w:abstractNum w:abstractNumId="27" w15:restartNumberingAfterBreak="0">
+  <w:abstractNum w:abstractNumId="28" w15:restartNumberingAfterBreak="0">
     <w:nsid w:val="57A8083A"/>
     <w:multiLevelType w:val="hybridMultilevel"/>
     <w:tmpl w:val="A9220CB8"/>
@@ -14041,7 +14582,7 @@
       </w:rPr>
     </w:lvl>
   </w:abstractNum>
-  <w:abstractNum w:abstractNumId="28" w15:restartNumberingAfterBreak="0">
+  <w:abstractNum w:abstractNumId="29" w15:restartNumberingAfterBreak="0">
     <w:nsid w:val="60BB3174"/>
     <w:multiLevelType w:val="hybridMultilevel"/>
     <w:tmpl w:val="E4A6399A"/>
@@ -14181,7 +14722,7 @@
       </w:rPr>
     </w:lvl>
   </w:abstractNum>
-  <w:abstractNum w:abstractNumId="29" w15:restartNumberingAfterBreak="0">
+  <w:abstractNum w:abstractNumId="30" w15:restartNumberingAfterBreak="0">
     <w:nsid w:val="67487CE0"/>
     <w:multiLevelType w:val="hybridMultilevel"/>
     <w:tmpl w:val="F0B8446E"/>
@@ -14270,7 +14811,7 @@
       </w:pPr>
     </w:lvl>
   </w:abstractNum>
-  <w:abstractNum w:abstractNumId="30" w15:restartNumberingAfterBreak="0">
+  <w:abstractNum w:abstractNumId="31" w15:restartNumberingAfterBreak="0">
     <w:nsid w:val="6BAF74FF"/>
     <w:multiLevelType w:val="hybridMultilevel"/>
     <w:tmpl w:val="59DA8A64"/>
@@ -14383,7 +14924,7 @@
       </w:rPr>
     </w:lvl>
   </w:abstractNum>
-  <w:abstractNum w:abstractNumId="31" w15:restartNumberingAfterBreak="0">
+  <w:abstractNum w:abstractNumId="32" w15:restartNumberingAfterBreak="0">
     <w:nsid w:val="6BF844C9"/>
     <w:multiLevelType w:val="hybridMultilevel"/>
     <w:tmpl w:val="4090657C"/>
@@ -14496,7 +15037,7 @@
       </w:rPr>
     </w:lvl>
   </w:abstractNum>
-  <w:abstractNum w:abstractNumId="32" w15:restartNumberingAfterBreak="0">
+  <w:abstractNum w:abstractNumId="33" w15:restartNumberingAfterBreak="0">
     <w:nsid w:val="6C2D4DF7"/>
     <w:multiLevelType w:val="hybridMultilevel"/>
     <w:tmpl w:val="60E836EA"/>
@@ -14585,7 +15126,7 @@
       </w:pPr>
     </w:lvl>
   </w:abstractNum>
-  <w:abstractNum w:abstractNumId="33" w15:restartNumberingAfterBreak="0">
+  <w:abstractNum w:abstractNumId="34" w15:restartNumberingAfterBreak="0">
     <w:nsid w:val="738F1125"/>
     <w:multiLevelType w:val="hybridMultilevel"/>
     <w:tmpl w:val="40708DC4"/>
@@ -14677,7 +15218,120 @@
       </w:pPr>
     </w:lvl>
   </w:abstractNum>
-  <w:abstractNum w:abstractNumId="34" w15:restartNumberingAfterBreak="0">
+  <w:abstractNum w:abstractNumId="35" w15:restartNumberingAfterBreak="0">
+    <w:nsid w:val="74635C7B"/>
+    <w:multiLevelType w:val="hybridMultilevel"/>
+    <w:tmpl w:val="4682742E"/>
+    <w:lvl w:ilvl="0" w:tplc="080A0001">
+      <w:start w:val="1"/>
+      <w:numFmt w:val="bullet"/>
+      <w:lvlText w:val=""/>
+      <w:lvlJc w:val="left"/>
+      <w:pPr>
+        <w:ind w:left="1440" w:hanging="360"/>
+      </w:pPr>
+      <w:rPr>
+        <w:rFonts w:ascii="Symbol" w:hAnsi="Symbol" w:hint="default"/>
+      </w:rPr>
+    </w:lvl>
+    <w:lvl w:ilvl="1" w:tplc="080A0003" w:tentative="1">
+      <w:start w:val="1"/>
+      <w:numFmt w:val="bullet"/>
+      <w:lvlText w:val="o"/>
+      <w:lvlJc w:val="left"/>
+      <w:pPr>
+        <w:ind w:left="2160" w:hanging="360"/>
+      </w:pPr>
+      <w:rPr>
+        <w:rFonts w:ascii="Courier New" w:hAnsi="Courier New" w:cs="Courier New" w:hint="default"/>
+      </w:rPr>
+    </w:lvl>
+    <w:lvl w:ilvl="2" w:tplc="080A0005" w:tentative="1">
+      <w:start w:val="1"/>
+      <w:numFmt w:val="bullet"/>
+      <w:lvlText w:val=""/>
+      <w:lvlJc w:val="left"/>
+      <w:pPr>
+        <w:ind w:left="2880" w:hanging="360"/>
+      </w:pPr>
+      <w:rPr>
+        <w:rFonts w:ascii="Wingdings" w:hAnsi="Wingdings" w:hint="default"/>
+      </w:rPr>
+    </w:lvl>
+    <w:lvl w:ilvl="3" w:tplc="080A0001" w:tentative="1">
+      <w:start w:val="1"/>
+      <w:numFmt w:val="bullet"/>
+      <w:lvlText w:val=""/>
+      <w:lvlJc w:val="left"/>
+      <w:pPr>
+        <w:ind w:left="3600" w:hanging="360"/>
+      </w:pPr>
+      <w:rPr>
+        <w:rFonts w:ascii="Symbol" w:hAnsi="Symbol" w:hint="default"/>
+      </w:rPr>
+    </w:lvl>
+    <w:lvl w:ilvl="4" w:tplc="080A0003" w:tentative="1">
+      <w:start w:val="1"/>
+      <w:numFmt w:val="bullet"/>
+      <w:lvlText w:val="o"/>
+      <w:lvlJc w:val="left"/>
+      <w:pPr>
+        <w:ind w:left="4320" w:hanging="360"/>
+      </w:pPr>
+      <w:rPr>
+        <w:rFonts w:ascii="Courier New" w:hAnsi="Courier New" w:cs="Courier New" w:hint="default"/>
+      </w:rPr>
+    </w:lvl>
+    <w:lvl w:ilvl="5" w:tplc="080A0005" w:tentative="1">
+      <w:start w:val="1"/>
+      <w:numFmt w:val="bullet"/>
+      <w:lvlText w:val=""/>
+      <w:lvlJc w:val="left"/>
+      <w:pPr>
+        <w:ind w:left="5040" w:hanging="360"/>
+      </w:pPr>
+      <w:rPr>
+        <w:rFonts w:ascii="Wingdings" w:hAnsi="Wingdings" w:hint="default"/>
+      </w:rPr>
+    </w:lvl>
+    <w:lvl w:ilvl="6" w:tplc="080A0001" w:tentative="1">
+      <w:start w:val="1"/>
+      <w:numFmt w:val="bullet"/>
+      <w:lvlText w:val=""/>
+      <w:lvlJc w:val="left"/>
+      <w:pPr>
+        <w:ind w:left="5760" w:hanging="360"/>
+      </w:pPr>
+      <w:rPr>
+        <w:rFonts w:ascii="Symbol" w:hAnsi="Symbol" w:hint="default"/>
+      </w:rPr>
+    </w:lvl>
+    <w:lvl w:ilvl="7" w:tplc="080A0003" w:tentative="1">
+      <w:start w:val="1"/>
+      <w:numFmt w:val="bullet"/>
+      <w:lvlText w:val="o"/>
+      <w:lvlJc w:val="left"/>
+      <w:pPr>
+        <w:ind w:left="6480" w:hanging="360"/>
+      </w:pPr>
+      <w:rPr>
+        <w:rFonts w:ascii="Courier New" w:hAnsi="Courier New" w:cs="Courier New" w:hint="default"/>
+      </w:rPr>
+    </w:lvl>
+    <w:lvl w:ilvl="8" w:tplc="080A0005" w:tentative="1">
+      <w:start w:val="1"/>
+      <w:numFmt w:val="bullet"/>
+      <w:lvlText w:val=""/>
+      <w:lvlJc w:val="left"/>
+      <w:pPr>
+        <w:ind w:left="7200" w:hanging="360"/>
+      </w:pPr>
+      <w:rPr>
+        <w:rFonts w:ascii="Wingdings" w:hAnsi="Wingdings" w:hint="default"/>
+      </w:rPr>
+    </w:lvl>
+  </w:abstractNum>
+  <w:abstractNum w:abstractNumId="36" w15:restartNumberingAfterBreak="0">
     <w:nsid w:val="75C9660B"/>
     <w:multiLevelType w:val="hybridMultilevel"/>
     <w:tmpl w:val="B9C65B2E"/>
@@ -14790,7 +15444,7 @@
       </w:rPr>
     </w:lvl>
   </w:abstractNum>
-  <w:abstractNum w:abstractNumId="35" w15:restartNumberingAfterBreak="0">
+  <w:abstractNum w:abstractNumId="37" w15:restartNumberingAfterBreak="0">
     <w:nsid w:val="77CA403E"/>
     <w:multiLevelType w:val="hybridMultilevel"/>
     <w:tmpl w:val="5EE017D0"/>
@@ -14876,7 +15530,7 @@
       </w:pPr>
     </w:lvl>
   </w:abstractNum>
-  <w:abstractNum w:abstractNumId="36" w15:restartNumberingAfterBreak="0">
+  <w:abstractNum w:abstractNumId="38" w15:restartNumberingAfterBreak="0">
     <w:nsid w:val="7DF90EC7"/>
     <w:multiLevelType w:val="hybridMultilevel"/>
     <w:tmpl w:val="60E836EA"/>
@@ -14965,7 +15619,7 @@
       </w:pPr>
     </w:lvl>
   </w:abstractNum>
-  <w:abstractNum w:abstractNumId="37" w15:restartNumberingAfterBreak="0">
+  <w:abstractNum w:abstractNumId="39" w15:restartNumberingAfterBreak="0">
     <w:nsid w:val="7FF12184"/>
     <w:multiLevelType w:val="hybridMultilevel"/>
     <w:tmpl w:val="FEA0F3C6"/>
@@ -15079,7 +15733,7 @@
     </w:lvl>
   </w:abstractNum>
   <w:num w:numId="1">
-    <w:abstractNumId w:val="22"/>
+    <w:abstractNumId w:val="23"/>
   </w:num>
   <w:num w:numId="2">
     <w:abstractNumId w:val="0"/>
@@ -15091,106 +15745,112 @@
     <w:abstractNumId w:val="2"/>
   </w:num>
   <w:num w:numId="5">
-    <w:abstractNumId w:val="19"/>
+    <w:abstractNumId w:val="20"/>
   </w:num>
   <w:num w:numId="6">
-    <w:abstractNumId w:val="27"/>
+    <w:abstractNumId w:val="28"/>
   </w:num>
   <w:num w:numId="7">
+    <w:abstractNumId w:val="13"/>
+  </w:num>
+  <w:num w:numId="8">
+    <w:abstractNumId w:val="34"/>
+  </w:num>
+  <w:num w:numId="9">
+    <w:abstractNumId w:val="18"/>
+  </w:num>
+  <w:num w:numId="10">
+    <w:abstractNumId w:val="15"/>
+  </w:num>
+  <w:num w:numId="11">
+    <w:abstractNumId w:val="8"/>
+  </w:num>
+  <w:num w:numId="12">
+    <w:abstractNumId w:val="16"/>
+  </w:num>
+  <w:num w:numId="13">
     <w:abstractNumId w:val="12"/>
   </w:num>
-  <w:num w:numId="8">
-    <w:abstractNumId w:val="33"/>
-  </w:num>
-  <w:num w:numId="9">
-    <w:abstractNumId w:val="17"/>
-  </w:num>
-  <w:num w:numId="10">
-    <w:abstractNumId w:val="14"/>
-  </w:num>
-  <w:num w:numId="11">
-    <w:abstractNumId w:val="7"/>
-  </w:num>
-  <w:num w:numId="12">
-    <w:abstractNumId w:val="15"/>
-  </w:num>
-  <w:num w:numId="13">
+  <w:num w:numId="14">
     <w:abstractNumId w:val="11"/>
   </w:num>
-  <w:num w:numId="14">
-    <w:abstractNumId w:val="10"/>
-  </w:num>
   <w:num w:numId="15">
-    <w:abstractNumId w:val="23"/>
+    <w:abstractNumId w:val="24"/>
   </w:num>
   <w:num w:numId="16">
     <w:abstractNumId w:val="3"/>
   </w:num>
   <w:num w:numId="17">
-    <w:abstractNumId w:val="36"/>
+    <w:abstractNumId w:val="38"/>
   </w:num>
   <w:num w:numId="18">
-    <w:abstractNumId w:val="21"/>
+    <w:abstractNumId w:val="22"/>
   </w:num>
   <w:num w:numId="19">
-    <w:abstractNumId w:val="29"/>
+    <w:abstractNumId w:val="30"/>
   </w:num>
   <w:num w:numId="20">
-    <w:abstractNumId w:val="25"/>
+    <w:abstractNumId w:val="26"/>
   </w:num>
   <w:num w:numId="21">
-    <w:abstractNumId w:val="16"/>
+    <w:abstractNumId w:val="17"/>
   </w:num>
   <w:num w:numId="22">
-    <w:abstractNumId w:val="32"/>
+    <w:abstractNumId w:val="33"/>
   </w:num>
   <w:num w:numId="23">
-    <w:abstractNumId w:val="26"/>
+    <w:abstractNumId w:val="27"/>
   </w:num>
   <w:num w:numId="24">
-    <w:abstractNumId w:val="31"/>
+    <w:abstractNumId w:val="32"/>
   </w:num>
   <w:num w:numId="25">
     <w:abstractNumId w:val="1"/>
   </w:num>
   <w:num w:numId="26">
-    <w:abstractNumId w:val="30"/>
+    <w:abstractNumId w:val="31"/>
   </w:num>
   <w:num w:numId="27">
-    <w:abstractNumId w:val="35"/>
+    <w:abstractNumId w:val="37"/>
   </w:num>
   <w:num w:numId="28">
-    <w:abstractNumId w:val="8"/>
+    <w:abstractNumId w:val="9"/>
   </w:num>
   <w:num w:numId="29">
-    <w:abstractNumId w:val="13"/>
+    <w:abstractNumId w:val="14"/>
   </w:num>
   <w:num w:numId="30">
     <w:abstractNumId w:val="4"/>
   </w:num>
   <w:num w:numId="31">
-    <w:abstractNumId w:val="9"/>
+    <w:abstractNumId w:val="10"/>
   </w:num>
   <w:num w:numId="32">
-    <w:abstractNumId w:val="20"/>
+    <w:abstractNumId w:val="21"/>
   </w:num>
   <w:num w:numId="33">
-    <w:abstractNumId w:val="37"/>
+    <w:abstractNumId w:val="39"/>
   </w:num>
   <w:num w:numId="34">
-    <w:abstractNumId w:val="18"/>
+    <w:abstractNumId w:val="19"/>
   </w:num>
   <w:num w:numId="35">
-    <w:abstractNumId w:val="28"/>
+    <w:abstractNumId w:val="29"/>
   </w:num>
   <w:num w:numId="36">
     <w:abstractNumId w:val="6"/>
   </w:num>
   <w:num w:numId="37">
-    <w:abstractNumId w:val="34"/>
+    <w:abstractNumId w:val="36"/>
   </w:num>
   <w:num w:numId="38">
-    <w:abstractNumId w:val="24"/>
+    <w:abstractNumId w:val="25"/>
+  </w:num>
+  <w:num w:numId="39">
+    <w:abstractNumId w:val="35"/>
+  </w:num>
+  <w:num w:numId="40">
+    <w:abstractNumId w:val="7"/>
   </w:num>
 </w:numbering>
 </file>

</xml_diff>